<commit_message>
Actualizacion mapa de servicios
</commit_message>
<xml_diff>
--- a/Mapa_de_Servicios_SP.docx
+++ b/Mapa_de_Servicios_SP.docx
@@ -41,7 +41,7 @@
           <w:sz w:val="21"/>
           <w:szCs w:val="21"/>
         </w:rPr>
-        <w:t xml:space="preserve">Versión V1.4 — Revisión 3/7: Obras, Consorcios y Empresas</w:t>
+        <w:t>Versión V1.5 — Revisión 4/7: Videoverificación como servicio propio; renombres en Consorcios</w:t>
       </w:r>
     </w:p>
     <w:p>
@@ -69,7 +69,7 @@
           <w:sz w:val="18"/>
           <w:szCs w:val="18"/>
         </w:rPr>
-        <w:t xml:space="preserve">Fuente: contenido vigente en pages/mapa-servicios.html (js/versiones/mapa-v1.4.js) del repositorio Web Interna SP.</w:t>
+        <w:t>Fuente: contenido vigente en pages/mapa-servicios.html (js/versiones/mapa-v1.5.js) del repositorio Web Interna SP.</w:t>
       </w:r>
     </w:p>
     <w:p>
@@ -398,7 +398,7 @@
                 <w:sz w:val="20"/>
                 <w:szCs w:val="20"/>
               </w:rPr>
-              <w:t xml:space="preserve">Cerco eléctrico</w:t>
+              <w:t xml:space="preserve">Videoverificación</w:t>
             </w:r>
           </w:p>
         </w:tc>
@@ -419,7 +419,7 @@
                 <w:sz w:val="20"/>
                 <w:szCs w:val="20"/>
               </w:rPr>
-              <w:t xml:space="preserve">Protección perimetral activa</w:t>
+              <w:t xml:space="preserve">Confirmación visual del evento desde la central</w:t>
             </w:r>
           </w:p>
         </w:tc>
@@ -427,6 +427,73 @@
           <w:tcPr>
             <w:tcW w:type="dxa" w:w="4360"/>
             <w:shd w:fill="FFFFFF" w:val="clear"/>
+            <w:tcMar>
+              <w:top w:type="dxa" w:w="100"/>
+              <w:left w:type="dxa" w:w="120"/>
+              <w:bottom w:type="dxa" w:w="100"/>
+              <w:right w:type="dxa" w:w="120"/>
+            </w:tcMar>
+          </w:tcPr>
+          <w:p>
+            <w:r>
+              <w:rPr>
+                <w:sz w:val="20"/>
+                <w:szCs w:val="20"/>
+              </w:rPr>
+              <w:t xml:space="preserve">Saber con certeza qué está pasando ante una alerta, en vez de depender de que alguien esté disponible para confirmarlo.</w:t>
+            </w:r>
+          </w:p>
+        </w:tc>
+      </w:tr>
+      <w:tr>
+        <w:tc>
+          <w:tcPr>
+            <w:tcW w:type="dxa" w:w="2400"/>
+            <w:shd w:fill="EEF1F6" w:val="clear"/>
+            <w:tcMar>
+              <w:top w:type="dxa" w:w="100"/>
+              <w:left w:type="dxa" w:w="120"/>
+              <w:bottom w:type="dxa" w:w="100"/>
+              <w:right w:type="dxa" w:w="120"/>
+            </w:tcMar>
+          </w:tcPr>
+          <w:p>
+            <w:r>
+              <w:rPr>
+                <w:b/>
+                <w:bCs/>
+                <w:sz w:val="20"/>
+                <w:szCs w:val="20"/>
+              </w:rPr>
+              <w:t xml:space="preserve">Cerco eléctrico</w:t>
+            </w:r>
+          </w:p>
+        </w:tc>
+        <w:tc>
+          <w:tcPr>
+            <w:tcW w:type="dxa" w:w="2600"/>
+            <w:shd w:fill="EEF1F6" w:val="clear"/>
+            <w:tcMar>
+              <w:top w:type="dxa" w:w="100"/>
+              <w:left w:type="dxa" w:w="120"/>
+              <w:bottom w:type="dxa" w:w="100"/>
+              <w:right w:type="dxa" w:w="120"/>
+            </w:tcMar>
+          </w:tcPr>
+          <w:p>
+            <w:r>
+              <w:rPr>
+                <w:sz w:val="20"/>
+                <w:szCs w:val="20"/>
+              </w:rPr>
+              <w:t xml:space="preserve">Protección perimetral activa</w:t>
+            </w:r>
+          </w:p>
+        </w:tc>
+        <w:tc>
+          <w:tcPr>
+            <w:tcW w:type="dxa" w:w="4360"/>
+            <w:shd w:fill="EEF1F6" w:val="clear"/>
             <w:tcMar>
               <w:top w:type="dxa" w:w="100"/>
               <w:left w:type="dxa" w:w="120"/>
@@ -706,23 +773,6 @@
     </w:p>
     <w:p>
       <w:pPr>
-        <w:pStyle w:val="ListParagraph"/>
-        <w:numPr>
-          <w:ilvl w:val="0"/>
-          <w:numId w:val="1"/>
-        </w:numPr>
-        <w:spacing w:after="60"/>
-      </w:pPr>
-      <w:r>
-        <w:rPr>
-          <w:sz w:val="21"/>
-          <w:szCs w:val="21"/>
-        </w:rPr>
-        <w:t xml:space="preserve">Video verificación desde la central ante alertas</w:t>
-      </w:r>
-    </w:p>
-    <w:p>
-      <w:pPr>
         <w:spacing w:after="100"/>
       </w:pPr>
       <w:r>
@@ -761,6 +811,128 @@
           <w:szCs w:val="21"/>
         </w:rPr>
         <w:t xml:space="preserve">Ante una alerta, la central puede ver las imágenes en tiempo real y actuar con información concreta, sin depender de la disponibilidad del cliente.</w:t>
+      </w:r>
+    </w:p>
+    <w:p>
+      <w:pPr>
+        <w:spacing w:after="100" w:before="240"/>
+      </w:pPr>
+      <w:r>
+        <w:rPr>
+          <w:b/>
+          <w:bCs/>
+          <w:color w:val="1B2A4A"/>
+          <w:sz w:val="24"/>
+          <w:szCs w:val="24"/>
+        </w:rPr>
+        <w:t xml:space="preserve">Videoverificación — Confirmación visual del evento desde la central</w:t>
+      </w:r>
+    </w:p>
+    <w:p>
+      <w:pPr>
+        <w:spacing w:after="80"/>
+      </w:pPr>
+      <w:r>
+        <w:rPr>
+          <w:b/>
+          <w:bCs/>
+          <w:sz w:val="21"/>
+          <w:szCs w:val="21"/>
+        </w:rPr>
+        <w:t xml:space="preserve">Incluye:</w:t>
+      </w:r>
+    </w:p>
+    <w:p>
+      <w:pPr>
+        <w:pStyle w:val="ListParagraph"/>
+        <w:numPr>
+          <w:ilvl w:val="0"/>
+          <w:numId w:val="1"/>
+        </w:numPr>
+        <w:spacing w:after="60"/>
+      </w:pPr>
+      <w:r>
+        <w:rPr>
+          <w:sz w:val="21"/>
+          <w:szCs w:val="21"/>
+        </w:rPr>
+        <w:t xml:space="preserve">Verificación visual desde la central ante cada alerta</w:t>
+      </w:r>
+    </w:p>
+    <w:p>
+      <w:pPr>
+        <w:pStyle w:val="ListParagraph"/>
+        <w:numPr>
+          <w:ilvl w:val="0"/>
+          <w:numId w:val="1"/>
+        </w:numPr>
+        <w:spacing w:after="60"/>
+      </w:pPr>
+      <w:r>
+        <w:rPr>
+          <w:sz w:val="21"/>
+          <w:szCs w:val="21"/>
+        </w:rPr>
+        <w:t xml:space="preserve">Confirmación del evento antes de disparar la respuesta</w:t>
+      </w:r>
+    </w:p>
+    <w:p>
+      <w:pPr>
+        <w:pStyle w:val="ListParagraph"/>
+        <w:numPr>
+          <w:ilvl w:val="0"/>
+          <w:numId w:val="1"/>
+        </w:numPr>
+        <w:spacing w:after="60"/>
+      </w:pPr>
+      <w:r>
+        <w:rPr>
+          <w:sz w:val="21"/>
+          <w:szCs w:val="21"/>
+        </w:rPr>
+        <w:t xml:space="preserve">Reporte con información concreta a SP Acuda o a las fuerzas de seguridad</w:t>
+      </w:r>
+    </w:p>
+    <w:p>
+      <w:pPr>
+        <w:spacing w:after="100"/>
+      </w:pPr>
+      <w:r>
+        <w:rPr>
+          <w:b/>
+          <w:bCs/>
+          <w:sz w:val="21"/>
+          <w:szCs w:val="21"/>
+        </w:rPr>
+        <w:t xml:space="preserve">Facturación: </w:t>
+      </w:r>
+      <w:r>
+        <w:rPr>
+          <w:sz w:val="21"/>
+          <w:szCs w:val="21"/>
+        </w:rPr>
+        <w:t xml:space="preserve">Incluido en el abono mensual del servicio de Videovigilancia contratado.</w:t>
+      </w:r>
+    </w:p>
+    <w:p>
+      <w:pPr>
+        <w:spacing w:after="100"/>
+      </w:pPr>
+      <w:r>
+        <w:rPr>
+          <w:b/>
+          <w:bCs/>
+          <w:sz w:val="21"/>
+          <w:szCs w:val="21"/>
+        </w:rPr>
+        <w:t xml:space="preserve">Diferencial: </w:t>
+      </w:r>
+      <w:r>
+        <w:rPr>
+          <w:sz w:val="21"/>
+          <w:szCs w:val="21"/>
+        </w:rPr>
+        <w:t xml:space="preserve">La central confirma visualmente lo que está pasando antes de actuar, en vez de responder a una alerta sin contexto.</w:t>
       </w:r>
     </w:p>
     <w:p>
@@ -1189,7 +1361,7 @@
                 <w:sz w:val="20"/>
                 <w:szCs w:val="20"/>
               </w:rPr>
-              <w:t xml:space="preserve">Control de accesos</w:t>
+              <w:t xml:space="preserve">Videoverificación</w:t>
             </w:r>
           </w:p>
         </w:tc>
@@ -1210,7 +1382,7 @@
                 <w:sz w:val="20"/>
                 <w:szCs w:val="20"/>
               </w:rPr>
-              <w:t xml:space="preserve">Registro y trazabilidad de ingresos</w:t>
+              <w:t xml:space="preserve">Confirmación visual del evento desde la central</w:t>
             </w:r>
           </w:p>
         </w:tc>
@@ -1218,6 +1390,73 @@
           <w:tcPr>
             <w:tcW w:type="dxa" w:w="4360"/>
             <w:shd w:fill="FFFFFF" w:val="clear"/>
+            <w:tcMar>
+              <w:top w:type="dxa" w:w="100"/>
+              <w:left w:type="dxa" w:w="120"/>
+              <w:bottom w:type="dxa" w:w="100"/>
+              <w:right w:type="dxa" w:w="120"/>
+            </w:tcMar>
+          </w:tcPr>
+          <w:p>
+            <w:r>
+              <w:rPr>
+                <w:sz w:val="20"/>
+                <w:szCs w:val="20"/>
+              </w:rPr>
+              <w:t xml:space="preserve">Confirmar si una alerta del local es real antes de movilizar una respuesta, evitando falsas alarmas.</w:t>
+            </w:r>
+          </w:p>
+        </w:tc>
+      </w:tr>
+      <w:tr>
+        <w:tc>
+          <w:tcPr>
+            <w:tcW w:type="dxa" w:w="2400"/>
+            <w:shd w:fill="EEF1F6" w:val="clear"/>
+            <w:tcMar>
+              <w:top w:type="dxa" w:w="100"/>
+              <w:left w:type="dxa" w:w="120"/>
+              <w:bottom w:type="dxa" w:w="100"/>
+              <w:right w:type="dxa" w:w="120"/>
+            </w:tcMar>
+          </w:tcPr>
+          <w:p>
+            <w:r>
+              <w:rPr>
+                <w:b/>
+                <w:bCs/>
+                <w:sz w:val="20"/>
+                <w:szCs w:val="20"/>
+              </w:rPr>
+              <w:t xml:space="preserve">Control de accesos</w:t>
+            </w:r>
+          </w:p>
+        </w:tc>
+        <w:tc>
+          <w:tcPr>
+            <w:tcW w:type="dxa" w:w="2600"/>
+            <w:shd w:fill="EEF1F6" w:val="clear"/>
+            <w:tcMar>
+              <w:top w:type="dxa" w:w="100"/>
+              <w:left w:type="dxa" w:w="120"/>
+              <w:bottom w:type="dxa" w:w="100"/>
+              <w:right w:type="dxa" w:w="120"/>
+            </w:tcMar>
+          </w:tcPr>
+          <w:p>
+            <w:r>
+              <w:rPr>
+                <w:sz w:val="20"/>
+                <w:szCs w:val="20"/>
+              </w:rPr>
+              <w:t xml:space="preserve">Registro y trazabilidad de ingresos</w:t>
+            </w:r>
+          </w:p>
+        </w:tc>
+        <w:tc>
+          <w:tcPr>
+            <w:tcW w:type="dxa" w:w="4360"/>
+            <w:shd w:fill="EEF1F6" w:val="clear"/>
             <w:tcMar>
               <w:top w:type="dxa" w:w="100"/>
               <w:left w:type="dxa" w:w="120"/>
@@ -1497,23 +1736,6 @@
     </w:p>
     <w:p>
       <w:pPr>
-        <w:pStyle w:val="ListParagraph"/>
-        <w:numPr>
-          <w:ilvl w:val="0"/>
-          <w:numId w:val="1"/>
-        </w:numPr>
-        <w:spacing w:after="60"/>
-      </w:pPr>
-      <w:r>
-        <w:rPr>
-          <w:sz w:val="21"/>
-          <w:szCs w:val="21"/>
-        </w:rPr>
-        <w:t xml:space="preserve">Video verificación desde la central ante alertas</w:t>
-      </w:r>
-    </w:p>
-    <w:p>
-      <w:pPr>
         <w:spacing w:after="100"/>
       </w:pPr>
       <w:r>
@@ -1552,6 +1774,128 @@
           <w:szCs w:val="21"/>
         </w:rPr>
         <w:t xml:space="preserve">La verificación desde la central permite confirmar el evento antes de actuar, evitando falsas alarmas. SP solo accede a las cámaras ante un evento de alarma.</w:t>
+      </w:r>
+    </w:p>
+    <w:p>
+      <w:pPr>
+        <w:spacing w:after="100" w:before="240"/>
+      </w:pPr>
+      <w:r>
+        <w:rPr>
+          <w:b/>
+          <w:bCs/>
+          <w:color w:val="1B2A4A"/>
+          <w:sz w:val="24"/>
+          <w:szCs w:val="24"/>
+        </w:rPr>
+        <w:t xml:space="preserve">Videoverificación — Confirmación visual del evento desde la central</w:t>
+      </w:r>
+    </w:p>
+    <w:p>
+      <w:pPr>
+        <w:spacing w:after="80"/>
+      </w:pPr>
+      <w:r>
+        <w:rPr>
+          <w:b/>
+          <w:bCs/>
+          <w:sz w:val="21"/>
+          <w:szCs w:val="21"/>
+        </w:rPr>
+        <w:t xml:space="preserve">Incluye:</w:t>
+      </w:r>
+    </w:p>
+    <w:p>
+      <w:pPr>
+        <w:pStyle w:val="ListParagraph"/>
+        <w:numPr>
+          <w:ilvl w:val="0"/>
+          <w:numId w:val="1"/>
+        </w:numPr>
+        <w:spacing w:after="60"/>
+      </w:pPr>
+      <w:r>
+        <w:rPr>
+          <w:sz w:val="21"/>
+          <w:szCs w:val="21"/>
+        </w:rPr>
+        <w:t xml:space="preserve">Verificación visual desde la central ante cada alerta</w:t>
+      </w:r>
+    </w:p>
+    <w:p>
+      <w:pPr>
+        <w:pStyle w:val="ListParagraph"/>
+        <w:numPr>
+          <w:ilvl w:val="0"/>
+          <w:numId w:val="1"/>
+        </w:numPr>
+        <w:spacing w:after="60"/>
+      </w:pPr>
+      <w:r>
+        <w:rPr>
+          <w:sz w:val="21"/>
+          <w:szCs w:val="21"/>
+        </w:rPr>
+        <w:t xml:space="preserve">Confirmación del evento antes de disparar la respuesta</w:t>
+      </w:r>
+    </w:p>
+    <w:p>
+      <w:pPr>
+        <w:pStyle w:val="ListParagraph"/>
+        <w:numPr>
+          <w:ilvl w:val="0"/>
+          <w:numId w:val="1"/>
+        </w:numPr>
+        <w:spacing w:after="60"/>
+      </w:pPr>
+      <w:r>
+        <w:rPr>
+          <w:sz w:val="21"/>
+          <w:szCs w:val="21"/>
+        </w:rPr>
+        <w:t xml:space="preserve">Reporte con información concreta al móvil acuda o a las fuerzas de seguridad</w:t>
+      </w:r>
+    </w:p>
+    <w:p>
+      <w:pPr>
+        <w:spacing w:after="100"/>
+      </w:pPr>
+      <w:r>
+        <w:rPr>
+          <w:b/>
+          <w:bCs/>
+          <w:sz w:val="21"/>
+          <w:szCs w:val="21"/>
+        </w:rPr>
+        <w:t xml:space="preserve">Facturación: </w:t>
+      </w:r>
+      <w:r>
+        <w:rPr>
+          <w:sz w:val="21"/>
+          <w:szCs w:val="21"/>
+        </w:rPr>
+        <w:t xml:space="preserve">Incluido en el abono mensual del servicio de Videovigilancia contratado.</w:t>
+      </w:r>
+    </w:p>
+    <w:p>
+      <w:pPr>
+        <w:spacing w:after="100"/>
+      </w:pPr>
+      <w:r>
+        <w:rPr>
+          <w:b/>
+          <w:bCs/>
+          <w:sz w:val="21"/>
+          <w:szCs w:val="21"/>
+        </w:rPr>
+        <w:t xml:space="preserve">Diferencial: </w:t>
+      </w:r>
+      <w:r>
+        <w:rPr>
+          <w:sz w:val="21"/>
+          <w:szCs w:val="21"/>
+        </w:rPr>
+        <w:t xml:space="preserve">SP solo accede a las cámaras ante un evento de alarma, y confirma visualmente antes de movilizar una respuesta.</w:t>
       </w:r>
     </w:p>
     <w:p>
@@ -2093,7 +2437,7 @@
           <w:sz w:val="21"/>
           <w:szCs w:val="21"/>
         </w:rPr>
-        <w:t xml:space="preserve">Seguridad para consorcios, edificios y depósitos. Vigilancia presencial, monitoreo remoto y control de perímetro para espacios comunes y accesos.</w:t>
+        <w:t>Seguridad para consorcios, edificios y depósitos. Vigilancia presencial, videovigilancia y control de accesos para espacios comunes y accesos.</w:t>
       </w:r>
     </w:p>
     <w:tbl>
@@ -2277,7 +2621,7 @@
                 <w:sz w:val="20"/>
                 <w:szCs w:val="20"/>
               </w:rPr>
-              <w:t xml:space="preserve">Monitoreo remoto</w:t>
+              <w:t>Videovigilancia</w:t>
             </w:r>
           </w:p>
         </w:tc>
@@ -2344,7 +2688,7 @@
                 <w:sz w:val="20"/>
                 <w:szCs w:val="20"/>
               </w:rPr>
-              <w:t xml:space="preserve">Control de perímetro</w:t>
+              <w:t>Videoverificación</w:t>
             </w:r>
           </w:p>
         </w:tc>
@@ -2365,7 +2709,7 @@
                 <w:sz w:val="20"/>
                 <w:szCs w:val="20"/>
               </w:rPr>
-              <w:t xml:space="preserve">Cerco y control de accesos</w:t>
+              <w:t xml:space="preserve">Confirmación visual del evento desde la central</w:t>
             </w:r>
           </w:p>
         </w:tc>
@@ -2373,6 +2717,73 @@
           <w:tcPr>
             <w:tcW w:type="dxa" w:w="4360"/>
             <w:shd w:fill="FFFFFF" w:val="clear"/>
+            <w:tcMar>
+              <w:top w:type="dxa" w:w="100"/>
+              <w:left w:type="dxa" w:w="120"/>
+              <w:bottom w:type="dxa" w:w="100"/>
+              <w:right w:type="dxa" w:w="120"/>
+            </w:tcMar>
+          </w:tcPr>
+          <w:p>
+            <w:r>
+              <w:rPr>
+                <w:sz w:val="20"/>
+                <w:szCs w:val="20"/>
+              </w:rPr>
+              <w:t xml:space="preserve">Confirmar visualmente los eventos en accesos y áreas comunes antes de dar aviso o movilizar una respuesta.</w:t>
+            </w:r>
+          </w:p>
+        </w:tc>
+      </w:tr>
+      <w:tr>
+        <w:tc>
+          <w:tcPr>
+            <w:tcW w:type="dxa" w:w="2400"/>
+            <w:shd w:fill="EEF1F6" w:val="clear"/>
+            <w:tcMar>
+              <w:top w:type="dxa" w:w="100"/>
+              <w:left w:type="dxa" w:w="120"/>
+              <w:bottom w:type="dxa" w:w="100"/>
+              <w:right w:type="dxa" w:w="120"/>
+            </w:tcMar>
+          </w:tcPr>
+          <w:p>
+            <w:r>
+              <w:rPr>
+                <w:b/>
+                <w:bCs/>
+                <w:sz w:val="20"/>
+                <w:szCs w:val="20"/>
+              </w:rPr>
+              <w:t>Control de accesos</w:t>
+            </w:r>
+          </w:p>
+        </w:tc>
+        <w:tc>
+          <w:tcPr>
+            <w:tcW w:type="dxa" w:w="2600"/>
+            <w:shd w:fill="EEF1F6" w:val="clear"/>
+            <w:tcMar>
+              <w:top w:type="dxa" w:w="100"/>
+              <w:left w:type="dxa" w:w="120"/>
+              <w:bottom w:type="dxa" w:w="100"/>
+              <w:right w:type="dxa" w:w="120"/>
+            </w:tcMar>
+          </w:tcPr>
+          <w:p>
+            <w:r>
+              <w:rPr>
+                <w:sz w:val="20"/>
+                <w:szCs w:val="20"/>
+              </w:rPr>
+              <w:t xml:space="preserve">Cerco y control de accesos</w:t>
+            </w:r>
+          </w:p>
+        </w:tc>
+        <w:tc>
+          <w:tcPr>
+            <w:tcW w:type="dxa" w:w="4360"/>
+            <w:shd w:fill="EEF1F6" w:val="clear"/>
             <w:tcMar>
               <w:top w:type="dxa" w:w="100"/>
               <w:left w:type="dxa" w:w="120"/>
@@ -2531,7 +2942,7 @@
           <w:sz w:val="24"/>
           <w:szCs w:val="24"/>
         </w:rPr>
-        <w:t xml:space="preserve">Monitoreo remoto — Cámaras móviles con grabación autónoma</w:t>
+        <w:t>Videovigilancia — Cámaras móviles con grabación autónoma</w:t>
       </w:r>
     </w:p>
     <w:p>
@@ -2653,7 +3064,129 @@
           <w:sz w:val="24"/>
           <w:szCs w:val="24"/>
         </w:rPr>
-        <w:t xml:space="preserve">Control de perímetro — Cerco y control de accesos</w:t>
+        <w:t xml:space="preserve">Videoverificación — Confirmación visual del evento desde la central</w:t>
+      </w:r>
+    </w:p>
+    <w:p>
+      <w:pPr>
+        <w:spacing w:after="80"/>
+      </w:pPr>
+      <w:r>
+        <w:rPr>
+          <w:b/>
+          <w:bCs/>
+          <w:sz w:val="21"/>
+          <w:szCs w:val="21"/>
+        </w:rPr>
+        <w:t xml:space="preserve">Incluye:</w:t>
+      </w:r>
+    </w:p>
+    <w:p>
+      <w:pPr>
+        <w:pStyle w:val="ListParagraph"/>
+        <w:numPr>
+          <w:ilvl w:val="0"/>
+          <w:numId w:val="1"/>
+        </w:numPr>
+        <w:spacing w:after="60"/>
+      </w:pPr>
+      <w:r>
+        <w:rPr>
+          <w:sz w:val="21"/>
+          <w:szCs w:val="21"/>
+        </w:rPr>
+        <w:t xml:space="preserve">Verificación visual desde la central ante cada alerta</w:t>
+      </w:r>
+    </w:p>
+    <w:p>
+      <w:pPr>
+        <w:pStyle w:val="ListParagraph"/>
+        <w:numPr>
+          <w:ilvl w:val="0"/>
+          <w:numId w:val="1"/>
+        </w:numPr>
+        <w:spacing w:after="60"/>
+      </w:pPr>
+      <w:r>
+        <w:rPr>
+          <w:sz w:val="21"/>
+          <w:szCs w:val="21"/>
+        </w:rPr>
+        <w:t xml:space="preserve">Confirmación del evento antes de disparar la respuesta</w:t>
+      </w:r>
+    </w:p>
+    <w:p>
+      <w:pPr>
+        <w:pStyle w:val="ListParagraph"/>
+        <w:numPr>
+          <w:ilvl w:val="0"/>
+          <w:numId w:val="1"/>
+        </w:numPr>
+        <w:spacing w:after="60"/>
+      </w:pPr>
+      <w:r>
+        <w:rPr>
+          <w:sz w:val="21"/>
+          <w:szCs w:val="21"/>
+        </w:rPr>
+        <w:t xml:space="preserve">Reporte con información concreta a la administración o a las fuerzas de seguridad</w:t>
+      </w:r>
+    </w:p>
+    <w:p>
+      <w:pPr>
+        <w:spacing w:after="100"/>
+      </w:pPr>
+      <w:r>
+        <w:rPr>
+          <w:b/>
+          <w:bCs/>
+          <w:sz w:val="21"/>
+          <w:szCs w:val="21"/>
+        </w:rPr>
+        <w:t xml:space="preserve">Facturación: </w:t>
+      </w:r>
+      <w:r>
+        <w:rPr>
+          <w:sz w:val="21"/>
+          <w:szCs w:val="21"/>
+        </w:rPr>
+        <w:t xml:space="preserve">Incluido en el abono mensual del servicio de Videovigilancia contratado.</w:t>
+      </w:r>
+    </w:p>
+    <w:p>
+      <w:pPr>
+        <w:spacing w:after="100"/>
+      </w:pPr>
+      <w:r>
+        <w:rPr>
+          <w:b/>
+          <w:bCs/>
+          <w:sz w:val="21"/>
+          <w:szCs w:val="21"/>
+        </w:rPr>
+        <w:t xml:space="preserve">Diferencial: </w:t>
+      </w:r>
+      <w:r>
+        <w:rPr>
+          <w:sz w:val="21"/>
+          <w:szCs w:val="21"/>
+        </w:rPr>
+        <w:t xml:space="preserve">La central confirma visualmente lo que está pasando en el edificio o consorcio antes de actuar, en vez de responder a una alerta sin contexto.</w:t>
+      </w:r>
+    </w:p>
+    <w:p>
+      <w:pPr>
+        <w:spacing w:after="100" w:before="240"/>
+      </w:pPr>
+      <w:r>
+        <w:rPr>
+          <w:b/>
+          <w:bCs/>
+          <w:color w:val="1B2A4A"/>
+          <w:sz w:val="24"/>
+          <w:szCs w:val="24"/>
+        </w:rPr>
+        <w:t>Control de accesos — Cerco y control de accesos</w:t>
       </w:r>
     </w:p>
     <w:p>
@@ -3937,7 +4470,7 @@
           <w:sz w:val="21"/>
           <w:szCs w:val="21"/>
         </w:rPr>
-        <w:t xml:space="preserve">Historial de revisiones del Mapa de Servicios tal como se registra en el código del portal (js/versiones/mapa-v1.0.js a mapa-v1.4.js).</w:t>
+        <w:t>Historial de revisiones del Mapa de Servicios tal como se registra en el código del portal (js/versiones/mapa-v1.0.js a mapa-v1.5.js).</w:t>
       </w:r>
     </w:p>
     <w:tbl>
@@ -4214,11 +4747,10 @@
               <w:rPr>
                 <w:b/>
                 <w:bCs/>
-                <w:color w:val="C0392B"/>
-                <w:sz w:val="20"/>
-                <w:szCs w:val="20"/>
-              </w:rPr>
-              <w:t xml:space="preserve">V1.4 (actual)</w:t>
+                <w:sz w:val="20"/>
+                <w:szCs w:val="20"/>
+              </w:rPr>
+              <w:t>V1.4</w:t>
             </w:r>
           </w:p>
         </w:tc>
@@ -4240,6 +4772,53 @@
                 <w:szCs w:val="20"/>
               </w:rPr>
               <w:t xml:space="preserve">Revisión 3/7 — se incorpora el segmento "Obras" (SP Obra Segura) y se completan Consorcios y Empresas, alineado a la estructura de referencia del PPT de Mapa de Servicios.</w:t>
+            </w:r>
+          </w:p>
+        </w:tc>
+      </w:tr>
+      <w:tr>
+        <w:tc>
+          <w:tcPr>
+            <w:tcW w:type="dxa" w:w="1560"/>
+            <w:shd w:fill="FFFFFF" w:val="clear"/>
+            <w:tcMar>
+              <w:top w:type="dxa" w:w="100"/>
+              <w:left w:type="dxa" w:w="120"/>
+              <w:bottom w:type="dxa" w:w="100"/>
+              <w:right w:type="dxa" w:w="120"/>
+            </w:tcMar>
+          </w:tcPr>
+          <w:p>
+            <w:r>
+              <w:rPr>
+                <w:b/>
+                <w:bCs/>
+                <w:color w:val="C0392B"/>
+                <w:sz w:val="20"/>
+                <w:szCs w:val="20"/>
+              </w:rPr>
+              <w:t>V1.5 (actual)</w:t>
+            </w:r>
+          </w:p>
+        </w:tc>
+        <w:tc>
+          <w:tcPr>
+            <w:tcW w:type="dxa" w:w="7800"/>
+            <w:shd w:fill="FFFFFF" w:val="clear"/>
+            <w:tcMar>
+              <w:top w:type="dxa" w:w="100"/>
+              <w:left w:type="dxa" w:w="120"/>
+              <w:bottom w:type="dxa" w:w="100"/>
+              <w:right w:type="dxa" w:w="120"/>
+            </w:tcMar>
+          </w:tcPr>
+          <w:p>
+            <w:r>
+              <w:rPr>
+                <w:sz w:val="20"/>
+                <w:szCs w:val="20"/>
+              </w:rPr>
+              <w:t xml:space="preserve">Revisión 4/7 — se separa Videoverificación como servicio propio en Hogar, Comercio y Consorcios y Edificios; en Consorcios y Edificios, "Monitoreo remoto" pasa a llamarse "Videovigilancia" y "Control de perímetro" pasa a llamarse "Control de accesos".</w:t>
             </w:r>
           </w:p>
         </w:tc>
@@ -4262,7 +4841,7 @@
           <w:sz w:val="21"/>
           <w:szCs w:val="21"/>
         </w:rPr>
-        <w:t xml:space="preserve">Nota: este documento refleja la versión V1.4, la más reciente cargada en el portal a la fecha indicada. Si el contenido del mapa se actualiza en el sitio, este documento debe regenerarse para mantenerse alineado.</w:t>
+        <w:t>Nota: este documento refleja la versión V1.5, la más reciente cargada en el portal a la fecha indicada. Si el contenido del mapa se actualiza en el sitio, este documento debe regenerarse para mantenerse alineado.</w:t>
       </w:r>
     </w:p>
     <w:sectPr>

</xml_diff>

<commit_message>
Modificaciones ficha hogar seguro
</commit_message>
<xml_diff>
--- a/Mapa_de_Servicios_SP.docx
+++ b/Mapa_de_Servicios_SP.docx
@@ -41,7 +41,7 @@
           <w:sz w:val="21"/>
           <w:szCs w:val="21"/>
         </w:rPr>
-        <w:t>Versión V1.5 — Revisión 4/7: Videoverificación como servicio propio; renombres en Consorcios</w:t>
+        <w:t>Versión V1.6 — Revisión 5/7: se agrega Glosario (final del documento) y Cancelación "[A completar]" al pie de cada uno de los 5 servicios principales (uno por segmento)</w:t>
       </w:r>
     </w:p>
     <w:p>
@@ -54,7 +54,7 @@
           <w:sz w:val="20"/>
           <w:szCs w:val="20"/>
         </w:rPr>
-        <w:t xml:space="preserve">Preparado para: Martin Wolcan  ·  Fecha: 13 de agosto de 2026</w:t>
+        <w:t>Preparado para: Martin Wolcan  ·  Fecha: 25 de agosto de 2026</w:t>
       </w:r>
     </w:p>
     <w:p>
@@ -693,6 +693,27 @@
     </w:p>
     <w:p>
       <w:pPr>
+        <w:spacing w:after="100"/>
+      </w:pPr>
+      <w:r>
+        <w:rPr>
+          <w:b/>
+          <w:bCs/>
+          <w:sz w:val="21"/>
+          <w:szCs w:val="21"/>
+        </w:rPr>
+        <w:t xml:space="preserve">Cancelación: </w:t>
+      </w:r>
+      <w:r>
+        <w:rPr>
+          <w:sz w:val="21"/>
+          <w:szCs w:val="21"/>
+        </w:rPr>
+        <w:t xml:space="preserve">[A completar]</w:t>
+      </w:r>
+    </w:p>
+    <w:p>
+      <w:pPr>
         <w:spacing w:after="100" w:before="240"/>
       </w:pPr>
       <w:r>
@@ -1656,6 +1677,27 @@
     </w:p>
     <w:p>
       <w:pPr>
+        <w:spacing w:after="100"/>
+      </w:pPr>
+      <w:r>
+        <w:rPr>
+          <w:b/>
+          <w:bCs/>
+          <w:sz w:val="21"/>
+          <w:szCs w:val="21"/>
+        </w:rPr>
+        <w:t xml:space="preserve">Cancelación: </w:t>
+      </w:r>
+      <w:r>
+        <w:rPr>
+          <w:sz w:val="21"/>
+          <w:szCs w:val="21"/>
+        </w:rPr>
+        <w:t xml:space="preserve">[A completar]</w:t>
+      </w:r>
+    </w:p>
+    <w:p>
+      <w:pPr>
         <w:spacing w:after="100" w:before="240"/>
       </w:pPr>
       <w:r>
@@ -2418,6 +2460,27 @@
     </w:p>
     <w:p>
       <w:pPr>
+        <w:spacing w:after="100"/>
+      </w:pPr>
+      <w:r>
+        <w:rPr>
+          <w:b/>
+          <w:bCs/>
+          <w:sz w:val="21"/>
+          <w:szCs w:val="21"/>
+        </w:rPr>
+        <w:t xml:space="preserve">Cancelación: </w:t>
+      </w:r>
+      <w:r>
+        <w:rPr>
+          <w:sz w:val="21"/>
+          <w:szCs w:val="21"/>
+        </w:rPr>
+        <w:t xml:space="preserve">[A completar] — la Facturación ya indica un plazo mínimo de contrato de 12 meses; falta la política de cancelación en sí (preaviso, penalidad, devolución de equipo).</w:t>
+      </w:r>
+    </w:p>
+    <w:p>
+      <w:pPr>
         <w:pStyle w:val="Heading1"/>
         <w:spacing w:after="200" w:before="400"/>
       </w:pPr>
@@ -2932,6 +2995,27 @@
     </w:p>
     <w:p>
       <w:pPr>
+        <w:spacing w:after="100"/>
+      </w:pPr>
+      <w:r>
+        <w:rPr>
+          <w:b/>
+          <w:bCs/>
+          <w:sz w:val="21"/>
+          <w:szCs w:val="21"/>
+        </w:rPr>
+        <w:t xml:space="preserve">Cancelación: </w:t>
+      </w:r>
+      <w:r>
+        <w:rPr>
+          <w:sz w:val="21"/>
+          <w:szCs w:val="21"/>
+        </w:rPr>
+        <w:t xml:space="preserve">[A completar]</w:t>
+      </w:r>
+    </w:p>
+    <w:p>
+      <w:pPr>
         <w:spacing w:after="100" w:before="240"/>
       </w:pPr>
       <w:r>
@@ -3745,6 +3829,27 @@
     </w:p>
     <w:p>
       <w:pPr>
+        <w:spacing w:after="100"/>
+      </w:pPr>
+      <w:r>
+        <w:rPr>
+          <w:b/>
+          <w:bCs/>
+          <w:sz w:val="21"/>
+          <w:szCs w:val="21"/>
+        </w:rPr>
+        <w:t xml:space="preserve">Cancelación: </w:t>
+      </w:r>
+      <w:r>
+        <w:rPr>
+          <w:sz w:val="21"/>
+          <w:szCs w:val="21"/>
+        </w:rPr>
+        <w:t xml:space="preserve">[A completar]</w:t>
+      </w:r>
+    </w:p>
+    <w:p>
+      <w:pPr>
         <w:spacing w:after="100" w:before="240"/>
       </w:pPr>
       <w:r>
@@ -4793,11 +4898,57 @@
               <w:rPr>
                 <w:b/>
                 <w:bCs/>
+                <w:sz w:val="20"/>
+                <w:szCs w:val="20"/>
+              </w:rPr>
+              <w:t>V1.5</w:t>
+            </w:r>
+          </w:p>
+        </w:tc>
+        <w:tc>
+          <w:tcPr>
+            <w:tcW w:type="dxa" w:w="7800"/>
+            <w:shd w:fill="FFFFFF" w:val="clear"/>
+            <w:tcMar>
+              <w:top w:type="dxa" w:w="100"/>
+              <w:left w:type="dxa" w:w="120"/>
+              <w:bottom w:type="dxa" w:w="100"/>
+              <w:right w:type="dxa" w:w="120"/>
+            </w:tcMar>
+          </w:tcPr>
+          <w:p>
+            <w:r>
+              <w:rPr>
+                <w:sz w:val="20"/>
+                <w:szCs w:val="20"/>
+              </w:rPr>
+              <w:t xml:space="preserve">Revisión 4/7 — se separa Videoverificación como servicio propio en Hogar, Comercio y Consorcios y Edificios; en Consorcios y Edificios, "Monitoreo remoto" pasa a llamarse "Videovigilancia" y "Control de perímetro" pasa a llamarse "Control de accesos".</w:t>
+            </w:r>
+          </w:p>
+        </w:tc>
+      </w:tr>
+      <w:tr>
+        <w:tc>
+          <w:tcPr>
+            <w:tcW w:type="dxa" w:w="1560"/>
+            <w:shd w:fill="FFFFFF" w:val="clear"/>
+            <w:tcMar>
+              <w:top w:type="dxa" w:w="100"/>
+              <w:left w:type="dxa" w:w="120"/>
+              <w:bottom w:type="dxa" w:w="100"/>
+              <w:right w:type="dxa" w:w="120"/>
+            </w:tcMar>
+          </w:tcPr>
+          <w:p>
+            <w:r>
+              <w:rPr>
+                <w:b/>
+                <w:bCs/>
+                <w:sz w:val="20"/>
+                <w:szCs w:val="20"/>
                 <w:color w:val="C0392B"/>
-                <w:sz w:val="20"/>
-                <w:szCs w:val="20"/>
-              </w:rPr>
-              <w:t>V1.5 (actual)</w:t>
+              </w:rPr>
+              <w:t>V1.6 (actual)</w:t>
             </w:r>
           </w:p>
         </w:tc>
@@ -4818,7 +4969,7 @@
                 <w:sz w:val="20"/>
                 <w:szCs w:val="20"/>
               </w:rPr>
-              <w:t xml:space="preserve">Revisión 4/7 — se separa Videoverificación como servicio propio en Hogar, Comercio y Consorcios y Edificios; en Consorcios y Edificios, "Monitoreo remoto" pasa a llamarse "Videovigilancia" y "Control de perímetro" pasa a llamarse "Control de accesos".</w:t>
+              <w:t>Revisión 5/7 — se agrega la sección "Glosario" (definiciones de términos técnicos y comerciales) al final del documento, y un renglón "Cancelación: [A completar]" al pie de cada uno de los 5 servicios principales (uno por segmento), pendiente de carga por Comercial/Legal. Cambio solo en este documento — no está reflejado en la web (js/versiones/mapa-v1.5.js sigue siendo la versión vigente en el portal).</w:t>
             </w:r>
           </w:p>
         </w:tc>
@@ -4841,9 +4992,1280 @@
           <w:sz w:val="21"/>
           <w:szCs w:val="21"/>
         </w:rPr>
-        <w:t>Nota: este documento refleja la versión V1.5, la más reciente cargada en el portal a la fecha indicada. Si el contenido del mapa se actualiza en el sitio, este documento debe regenerarse para mantenerse alineado.</w:t>
-      </w:r>
-    </w:p>
+        <w:t>Nota: el contenido de los servicios (segmentos, tarjetas y transversales) refleja la versión v1.5 del portal, la más reciente cargada en el sitio a la fecha indicada. Las secciones "Glosario" y "Condiciones de cancelación", agregadas en la V1.6 de este documento, existen únicamente en este Word — no tienen todavía un equivalente en pages/mapa-servicios.html. Si el contenido de los servicios se actualiza en el sitio, este documento debe regenerarse para mantenerse alineado.</w:t>
+      </w:r>
+    </w:p>
+    <w:p>
+      <w:pPr>
+        <w:pStyle w:val="Heading1"/>
+        <w:spacing w:after="200" w:before="400"/>
+      </w:pPr>
+      <w:r>
+        <w:t xml:space="preserve">Glosario</w:t>
+      </w:r>
+    </w:p>
+    <w:p>
+      <w:pPr>
+        <w:spacing w:after="120"/>
+      </w:pPr>
+      <w:r>
+        <w:rPr>
+          <w:i w:val="false"/>
+          <w:iCs w:val="false"/>
+          <w:color w:val="222222"/>
+          <w:sz w:val="21"/>
+          <w:szCs w:val="21"/>
+        </w:rPr>
+        <w:t xml:space="preserve">Definiciones de los términos técnicos y comerciales usados a lo largo de este documento, en orden alfabético.</w:t>
+      </w:r>
+    </w:p>
+    <w:tbl>
+      <w:tblPr>
+        <w:tblW w:type="dxa" w:w="9360"/>
+        <w:tblBorders>
+          <w:top w:val="single" w:color="auto" w:sz="4"/>
+          <w:left w:val="single" w:color="auto" w:sz="4"/>
+          <w:bottom w:val="single" w:color="auto" w:sz="4"/>
+          <w:right w:val="single" w:color="auto" w:sz="4"/>
+          <w:insideH w:val="single" w:color="auto" w:sz="4"/>
+          <w:insideV w:val="single" w:color="auto" w:sz="4"/>
+        </w:tblBorders>
+      </w:tblPr>
+      <w:tblGrid>
+        <w:gridCol w:w="2800"/>
+        <w:gridCol w:w="6560"/>
+      </w:tblGrid>
+      <w:tr>
+        <w:trPr>
+          <w:tblHeader/>
+          <w:cantSplit/>
+        </w:trPr>
+        <w:tc>
+          <w:tcPr>
+            <w:tcW w:type="dxa" w:w="2800"/>
+            <w:shd w:fill="1B2A4A" w:val="clear"/>
+            <w:tcMar>
+              <w:top w:type="dxa" w:w="100"/>
+              <w:left w:type="dxa" w:w="120"/>
+              <w:bottom w:type="dxa" w:w="100"/>
+              <w:right w:type="dxa" w:w="120"/>
+            </w:tcMar>
+          </w:tcPr>
+          <w:p>
+            <w:r>
+              <w:rPr>
+                <w:b/>
+                <w:bCs/>
+                <w:color w:val="FFFFFF"/>
+                <w:sz w:val="20"/>
+                <w:szCs w:val="20"/>
+              </w:rPr>
+              <w:t xml:space="preserve">Término</w:t>
+            </w:r>
+          </w:p>
+        </w:tc>
+        <w:tc>
+          <w:tcPr>
+            <w:tcW w:type="dxa" w:w="6560"/>
+            <w:shd w:fill="1B2A4A" w:val="clear"/>
+            <w:tcMar>
+              <w:top w:type="dxa" w:w="100"/>
+              <w:left w:type="dxa" w:w="120"/>
+              <w:bottom w:type="dxa" w:w="100"/>
+              <w:right w:type="dxa" w:w="120"/>
+            </w:tcMar>
+          </w:tcPr>
+          <w:p>
+            <w:r>
+              <w:rPr>
+                <w:b/>
+                <w:bCs/>
+                <w:color w:val="FFFFFF"/>
+                <w:sz w:val="20"/>
+                <w:szCs w:val="20"/>
+              </w:rPr>
+              <w:t xml:space="preserve">Definición</w:t>
+            </w:r>
+          </w:p>
+        </w:tc>
+      </w:tr>
+      <w:tr>
+        <w:trPr>
+          <w:cantSplit/>
+        </w:trPr>
+        <w:tc>
+          <w:tcPr>
+            <w:tcW w:type="dxa" w:w="2800"/>
+            <w:shd w:fill="FFFFFF" w:val="clear"/>
+            <w:tcMar>
+              <w:top w:type="dxa" w:w="100"/>
+              <w:left w:type="dxa" w:w="120"/>
+              <w:bottom w:type="dxa" w:w="100"/>
+              <w:right w:type="dxa" w:w="120"/>
+            </w:tcMar>
+          </w:tcPr>
+          <w:p>
+            <w:r>
+              <w:rPr>
+                <w:b/>
+                <w:bCs/>
+                <w:sz w:val="20"/>
+                <w:szCs w:val="20"/>
+              </w:rPr>
+              <w:t xml:space="preserve">Abono mensual</w:t>
+            </w:r>
+          </w:p>
+        </w:tc>
+        <w:tc>
+          <w:tcPr>
+            <w:tcW w:type="dxa" w:w="6560"/>
+            <w:shd w:fill="FFFFFF" w:val="clear"/>
+            <w:tcMar>
+              <w:top w:type="dxa" w:w="100"/>
+              <w:left w:type="dxa" w:w="120"/>
+              <w:bottom w:type="dxa" w:w="100"/>
+              <w:right w:type="dxa" w:w="120"/>
+            </w:tcMar>
+          </w:tcPr>
+          <w:p>
+            <w:r>
+              <w:rPr>
+                <w:sz w:val="20"/>
+                <w:szCs w:val="20"/>
+              </w:rPr>
+              <w:t xml:space="preserve">Pago periódico (mensual) que cubre el servicio de monitoreo y/o mantenimiento mientras dura el contrato, sin incluir el cargo de instalación.</w:t>
+            </w:r>
+          </w:p>
+        </w:tc>
+      </w:tr>
+      <w:tr>
+        <w:trPr>
+          <w:cantSplit/>
+        </w:trPr>
+        <w:tc>
+          <w:tcPr>
+            <w:tcW w:type="dxa" w:w="2800"/>
+            <w:shd w:fill="EEF1F6" w:val="clear"/>
+            <w:tcMar>
+              <w:top w:type="dxa" w:w="100"/>
+              <w:left w:type="dxa" w:w="120"/>
+              <w:bottom w:type="dxa" w:w="100"/>
+              <w:right w:type="dxa" w:w="120"/>
+            </w:tcMar>
+          </w:tcPr>
+          <w:p>
+            <w:r>
+              <w:rPr>
+                <w:b/>
+                <w:bCs/>
+                <w:sz w:val="20"/>
+                <w:szCs w:val="20"/>
+              </w:rPr>
+              <w:t xml:space="preserve">App Ajax Security / Hik-Connect</w:t>
+            </w:r>
+          </w:p>
+        </w:tc>
+        <w:tc>
+          <w:tcPr>
+            <w:tcW w:type="dxa" w:w="6560"/>
+            <w:shd w:fill="EEF1F6" w:val="clear"/>
+            <w:tcMar>
+              <w:top w:type="dxa" w:w="100"/>
+              <w:left w:type="dxa" w:w="120"/>
+              <w:bottom w:type="dxa" w:w="100"/>
+              <w:right w:type="dxa" w:w="120"/>
+            </w:tcMar>
+          </w:tcPr>
+          <w:p>
+            <w:r>
+              <w:rPr>
+                <w:sz w:val="20"/>
+                <w:szCs w:val="20"/>
+              </w:rPr>
+              <w:t xml:space="preserve">Aplicaciones para celular con las que el cliente controla el sistema de forma remota: armado/desarmado, notificaciones y, según el equipo instalado, acceso a cámaras.</w:t>
+            </w:r>
+          </w:p>
+        </w:tc>
+      </w:tr>
+      <w:tr>
+        <w:trPr>
+          <w:cantSplit/>
+        </w:trPr>
+        <w:tc>
+          <w:tcPr>
+            <w:tcW w:type="dxa" w:w="2800"/>
+            <w:shd w:fill="FFFFFF" w:val="clear"/>
+            <w:tcMar>
+              <w:top w:type="dxa" w:w="100"/>
+              <w:left w:type="dxa" w:w="120"/>
+              <w:bottom w:type="dxa" w:w="100"/>
+              <w:right w:type="dxa" w:w="120"/>
+            </w:tcMar>
+          </w:tcPr>
+          <w:p>
+            <w:r>
+              <w:rPr>
+                <w:b/>
+                <w:bCs/>
+                <w:sz w:val="20"/>
+                <w:szCs w:val="20"/>
+              </w:rPr>
+              <w:t xml:space="preserve">Botón de pánico</w:t>
+            </w:r>
+          </w:p>
+        </w:tc>
+        <w:tc>
+          <w:tcPr>
+            <w:tcW w:type="dxa" w:w="6560"/>
+            <w:shd w:fill="FFFFFF" w:val="clear"/>
+            <w:tcMar>
+              <w:top w:type="dxa" w:w="100"/>
+              <w:left w:type="dxa" w:w="120"/>
+              <w:bottom w:type="dxa" w:w="100"/>
+              <w:right w:type="dxa" w:w="120"/>
+            </w:tcMar>
+          </w:tcPr>
+          <w:p>
+            <w:r>
+              <w:rPr>
+                <w:sz w:val="20"/>
+                <w:szCs w:val="20"/>
+              </w:rPr>
+              <w:t xml:space="preserve">Dispositivo que permite alertar a la central de monitoreo en forma inmediata y silenciosa ante una situación de riesgo, sin necesidad de armar o desarmar el sistema.</w:t>
+            </w:r>
+          </w:p>
+        </w:tc>
+      </w:tr>
+      <w:tr>
+        <w:trPr>
+          <w:cantSplit/>
+        </w:trPr>
+        <w:tc>
+          <w:tcPr>
+            <w:tcW w:type="dxa" w:w="2800"/>
+            <w:shd w:fill="EEF1F6" w:val="clear"/>
+            <w:tcMar>
+              <w:top w:type="dxa" w:w="100"/>
+              <w:left w:type="dxa" w:w="120"/>
+              <w:bottom w:type="dxa" w:w="100"/>
+              <w:right w:type="dxa" w:w="120"/>
+            </w:tcMar>
+          </w:tcPr>
+          <w:p>
+            <w:r>
+              <w:rPr>
+                <w:b/>
+                <w:bCs/>
+                <w:sz w:val="20"/>
+                <w:szCs w:val="20"/>
+              </w:rPr>
+              <w:t xml:space="preserve">Cargo de instalación</w:t>
+            </w:r>
+          </w:p>
+        </w:tc>
+        <w:tc>
+          <w:tcPr>
+            <w:tcW w:type="dxa" w:w="6560"/>
+            <w:shd w:fill="EEF1F6" w:val="clear"/>
+            <w:tcMar>
+              <w:top w:type="dxa" w:w="100"/>
+              <w:left w:type="dxa" w:w="120"/>
+              <w:bottom w:type="dxa" w:w="100"/>
+              <w:right w:type="dxa" w:w="120"/>
+            </w:tcMar>
+          </w:tcPr>
+          <w:p>
+            <w:r>
+              <w:rPr>
+                <w:sz w:val="20"/>
+                <w:szCs w:val="20"/>
+              </w:rPr>
+              <w:t xml:space="preserve">Pago único que cubre la puesta en marcha del sistema (mano de obra y, según el servicio, parte del equipamiento), independiente del abono mensual.</w:t>
+            </w:r>
+          </w:p>
+        </w:tc>
+      </w:tr>
+      <w:tr>
+        <w:trPr>
+          <w:cantSplit/>
+        </w:trPr>
+        <w:tc>
+          <w:tcPr>
+            <w:tcW w:type="dxa" w:w="2800"/>
+            <w:shd w:fill="FFFFFF" w:val="clear"/>
+            <w:tcMar>
+              <w:top w:type="dxa" w:w="100"/>
+              <w:left w:type="dxa" w:w="120"/>
+              <w:bottom w:type="dxa" w:w="100"/>
+              <w:right w:type="dxa" w:w="120"/>
+            </w:tcMar>
+          </w:tcPr>
+          <w:p>
+            <w:r>
+              <w:rPr>
+                <w:b/>
+                <w:bCs/>
+                <w:sz w:val="20"/>
+                <w:szCs w:val="20"/>
+              </w:rPr>
+              <w:t xml:space="preserve">Central de monitoreo</w:t>
+            </w:r>
+          </w:p>
+        </w:tc>
+        <w:tc>
+          <w:tcPr>
+            <w:tcW w:type="dxa" w:w="6560"/>
+            <w:shd w:fill="FFFFFF" w:val="clear"/>
+            <w:tcMar>
+              <w:top w:type="dxa" w:w="100"/>
+              <w:left w:type="dxa" w:w="120"/>
+              <w:bottom w:type="dxa" w:w="100"/>
+              <w:right w:type="dxa" w:w="120"/>
+            </w:tcMar>
+          </w:tcPr>
+          <w:p>
+            <w:r>
+              <w:rPr>
+                <w:sz w:val="20"/>
+                <w:szCs w:val="20"/>
+              </w:rPr>
+              <w:t xml:space="preserve">Centro operativo de SP que recibe las señales de los sistemas instalados las 24 horas y coordina la respuesta ante cada evento.</w:t>
+            </w:r>
+          </w:p>
+        </w:tc>
+      </w:tr>
+      <w:tr>
+        <w:trPr>
+          <w:cantSplit/>
+        </w:trPr>
+        <w:tc>
+          <w:tcPr>
+            <w:tcW w:type="dxa" w:w="2800"/>
+            <w:shd w:fill="EEF1F6" w:val="clear"/>
+            <w:tcMar>
+              <w:top w:type="dxa" w:w="100"/>
+              <w:left w:type="dxa" w:w="120"/>
+              <w:bottom w:type="dxa" w:w="100"/>
+              <w:right w:type="dxa" w:w="120"/>
+            </w:tcMar>
+          </w:tcPr>
+          <w:p>
+            <w:r>
+              <w:rPr>
+                <w:b/>
+                <w:bCs/>
+                <w:sz w:val="20"/>
+                <w:szCs w:val="20"/>
+              </w:rPr>
+              <w:t xml:space="preserve">Cerco eléctrico</w:t>
+            </w:r>
+          </w:p>
+        </w:tc>
+        <w:tc>
+          <w:tcPr>
+            <w:tcW w:type="dxa" w:w="6560"/>
+            <w:shd w:fill="EEF1F6" w:val="clear"/>
+            <w:tcMar>
+              <w:top w:type="dxa" w:w="100"/>
+              <w:left w:type="dxa" w:w="120"/>
+              <w:bottom w:type="dxa" w:w="100"/>
+              <w:right w:type="dxa" w:w="120"/>
+            </w:tcMar>
+          </w:tcPr>
+          <w:p>
+            <w:r>
+              <w:rPr>
+                <w:sz w:val="20"/>
+                <w:szCs w:val="20"/>
+              </w:rPr>
+              <w:t xml:space="preserve">Sistema perimetral de alta tensión no letal que actúa como barrera física y como sensor: cualquier contacto genera una alerta hacia la central.</w:t>
+            </w:r>
+          </w:p>
+        </w:tc>
+      </w:tr>
+      <w:tr>
+        <w:trPr>
+          <w:cantSplit/>
+        </w:trPr>
+        <w:tc>
+          <w:tcPr>
+            <w:tcW w:type="dxa" w:w="2800"/>
+            <w:shd w:fill="FFFFFF" w:val="clear"/>
+            <w:tcMar>
+              <w:top w:type="dxa" w:w="100"/>
+              <w:left w:type="dxa" w:w="120"/>
+              <w:bottom w:type="dxa" w:w="100"/>
+              <w:right w:type="dxa" w:w="120"/>
+            </w:tcMar>
+          </w:tcPr>
+          <w:p>
+            <w:r>
+              <w:rPr>
+                <w:b/>
+                <w:bCs/>
+                <w:sz w:val="20"/>
+                <w:szCs w:val="20"/>
+              </w:rPr>
+              <w:t xml:space="preserve">Comodato</w:t>
+            </w:r>
+          </w:p>
+        </w:tc>
+        <w:tc>
+          <w:tcPr>
+            <w:tcW w:type="dxa" w:w="6560"/>
+            <w:shd w:fill="FFFFFF" w:val="clear"/>
+            <w:tcMar>
+              <w:top w:type="dxa" w:w="100"/>
+              <w:left w:type="dxa" w:w="120"/>
+              <w:bottom w:type="dxa" w:w="100"/>
+              <w:right w:type="dxa" w:w="120"/>
+            </w:tcMar>
+          </w:tcPr>
+          <w:p>
+            <w:r>
+              <w:rPr>
+                <w:sz w:val="20"/>
+                <w:szCs w:val="20"/>
+              </w:rPr>
+              <w:t xml:space="preserve">Modalidad en la que el equipamiento sigue siendo propiedad de SP y se cede en préstamo de uso al cliente; el mantenimiento y la reposición del equipo quedan a cargo de SP.</w:t>
+            </w:r>
+          </w:p>
+        </w:tc>
+      </w:tr>
+      <w:tr>
+        <w:trPr>
+          <w:cantSplit/>
+        </w:trPr>
+        <w:tc>
+          <w:tcPr>
+            <w:tcW w:type="dxa" w:w="2800"/>
+            <w:shd w:fill="EEF1F6" w:val="clear"/>
+            <w:tcMar>
+              <w:top w:type="dxa" w:w="100"/>
+              <w:left w:type="dxa" w:w="120"/>
+              <w:bottom w:type="dxa" w:w="100"/>
+              <w:right w:type="dxa" w:w="120"/>
+            </w:tcMar>
+          </w:tcPr>
+          <w:p>
+            <w:r>
+              <w:rPr>
+                <w:b/>
+                <w:bCs/>
+                <w:sz w:val="20"/>
+                <w:szCs w:val="20"/>
+              </w:rPr>
+              <w:t xml:space="preserve">Comunicador 4G</w:t>
+            </w:r>
+          </w:p>
+        </w:tc>
+        <w:tc>
+          <w:tcPr>
+            <w:tcW w:type="dxa" w:w="6560"/>
+            <w:shd w:fill="EEF1F6" w:val="clear"/>
+            <w:tcMar>
+              <w:top w:type="dxa" w:w="100"/>
+              <w:left w:type="dxa" w:w="120"/>
+              <w:bottom w:type="dxa" w:w="100"/>
+              <w:right w:type="dxa" w:w="120"/>
+            </w:tcMar>
+          </w:tcPr>
+          <w:p>
+            <w:r>
+              <w:rPr>
+                <w:sz w:val="20"/>
+                <w:szCs w:val="20"/>
+              </w:rPr>
+              <w:t xml:space="preserve">Módulo que envía las señales del panel de alarma a la central de monitoreo por red celular, como respaldo o alternativa a la conexión fija.</w:t>
+            </w:r>
+          </w:p>
+        </w:tc>
+      </w:tr>
+      <w:tr>
+        <w:trPr>
+          <w:cantSplit/>
+        </w:trPr>
+        <w:tc>
+          <w:tcPr>
+            <w:tcW w:type="dxa" w:w="2800"/>
+            <w:shd w:fill="FFFFFF" w:val="clear"/>
+            <w:tcMar>
+              <w:top w:type="dxa" w:w="100"/>
+              <w:left w:type="dxa" w:w="120"/>
+              <w:bottom w:type="dxa" w:w="100"/>
+              <w:right w:type="dxa" w:w="120"/>
+            </w:tcMar>
+          </w:tcPr>
+          <w:p>
+            <w:r>
+              <w:rPr>
+                <w:b/>
+                <w:bCs/>
+                <w:sz w:val="20"/>
+                <w:szCs w:val="20"/>
+              </w:rPr>
+              <w:t xml:space="preserve">Control de accesos</w:t>
+            </w:r>
+          </w:p>
+        </w:tc>
+        <w:tc>
+          <w:tcPr>
+            <w:tcW w:type="dxa" w:w="6560"/>
+            <w:shd w:fill="FFFFFF" w:val="clear"/>
+            <w:tcMar>
+              <w:top w:type="dxa" w:w="100"/>
+              <w:left w:type="dxa" w:w="120"/>
+              <w:bottom w:type="dxa" w:w="100"/>
+              <w:right w:type="dxa" w:w="120"/>
+            </w:tcMar>
+          </w:tcPr>
+          <w:p>
+            <w:r>
+              <w:rPr>
+                <w:sz w:val="20"/>
+                <w:szCs w:val="20"/>
+              </w:rPr>
+              <w:t xml:space="preserve">Sistema que regula y registra el ingreso y egreso de personas o vehículos a un espacio (por tarjeta, código o biometría, según el caso).</w:t>
+            </w:r>
+          </w:p>
+        </w:tc>
+      </w:tr>
+      <w:tr>
+        <w:trPr>
+          <w:cantSplit/>
+        </w:trPr>
+        <w:tc>
+          <w:tcPr>
+            <w:tcW w:type="dxa" w:w="2800"/>
+            <w:shd w:fill="EEF1F6" w:val="clear"/>
+            <w:tcMar>
+              <w:top w:type="dxa" w:w="100"/>
+              <w:left w:type="dxa" w:w="120"/>
+              <w:bottom w:type="dxa" w:w="100"/>
+              <w:right w:type="dxa" w:w="120"/>
+            </w:tcMar>
+          </w:tcPr>
+          <w:p>
+            <w:r>
+              <w:rPr>
+                <w:b/>
+                <w:bCs/>
+                <w:sz w:val="20"/>
+                <w:szCs w:val="20"/>
+              </w:rPr>
+              <w:t xml:space="preserve">Ficha de producto</w:t>
+            </w:r>
+          </w:p>
+        </w:tc>
+        <w:tc>
+          <w:tcPr>
+            <w:tcW w:type="dxa" w:w="6560"/>
+            <w:shd w:fill="EEF1F6" w:val="clear"/>
+            <w:tcMar>
+              <w:top w:type="dxa" w:w="100"/>
+              <w:left w:type="dxa" w:w="120"/>
+              <w:bottom w:type="dxa" w:w="100"/>
+              <w:right w:type="dxa" w:w="120"/>
+            </w:tcMar>
+          </w:tcPr>
+          <w:p>
+            <w:r>
+              <w:rPr>
+                <w:sz w:val="20"/>
+                <w:szCs w:val="20"/>
+              </w:rPr>
+              <w:t xml:space="preserve">Documento interno con el detalle comercial, técnico y de proceso de un servicio específico (precios, condiciones, FAQ, etc.), complementario a este Mapa de Servicios.</w:t>
+            </w:r>
+          </w:p>
+        </w:tc>
+      </w:tr>
+      <w:tr>
+        <w:trPr>
+          <w:cantSplit/>
+        </w:trPr>
+        <w:tc>
+          <w:tcPr>
+            <w:tcW w:type="dxa" w:w="2800"/>
+            <w:shd w:fill="FFFFFF" w:val="clear"/>
+            <w:tcMar>
+              <w:top w:type="dxa" w:w="100"/>
+              <w:left w:type="dxa" w:w="120"/>
+              <w:bottom w:type="dxa" w:w="100"/>
+              <w:right w:type="dxa" w:w="120"/>
+            </w:tcMar>
+          </w:tcPr>
+          <w:p>
+            <w:r>
+              <w:rPr>
+                <w:b/>
+                <w:bCs/>
+                <w:sz w:val="20"/>
+                <w:szCs w:val="20"/>
+              </w:rPr>
+              <w:t xml:space="preserve">Mantenimiento preventivo y correctivo</w:t>
+            </w:r>
+          </w:p>
+        </w:tc>
+        <w:tc>
+          <w:tcPr>
+            <w:tcW w:type="dxa" w:w="6560"/>
+            <w:shd w:fill="FFFFFF" w:val="clear"/>
+            <w:tcMar>
+              <w:top w:type="dxa" w:w="100"/>
+              <w:left w:type="dxa" w:w="120"/>
+              <w:bottom w:type="dxa" w:w="100"/>
+              <w:right w:type="dxa" w:w="120"/>
+            </w:tcMar>
+          </w:tcPr>
+          <w:p>
+            <w:r>
+              <w:rPr>
+                <w:sz w:val="20"/>
+                <w:szCs w:val="20"/>
+              </w:rPr>
+              <w:t xml:space="preserve">Revisión periódica (preventivo) y reparación ante fallas (correctivo) del equipamiento instalado, para asegurar su funcionamiento continuo.</w:t>
+            </w:r>
+          </w:p>
+        </w:tc>
+      </w:tr>
+      <w:tr>
+        <w:trPr>
+          <w:cantSplit/>
+        </w:trPr>
+        <w:tc>
+          <w:tcPr>
+            <w:tcW w:type="dxa" w:w="2800"/>
+            <w:shd w:fill="EEF1F6" w:val="clear"/>
+            <w:tcMar>
+              <w:top w:type="dxa" w:w="100"/>
+              <w:left w:type="dxa" w:w="120"/>
+              <w:bottom w:type="dxa" w:w="100"/>
+              <w:right w:type="dxa" w:w="120"/>
+            </w:tcMar>
+          </w:tcPr>
+          <w:p>
+            <w:r>
+              <w:rPr>
+                <w:b/>
+                <w:bCs/>
+                <w:sz w:val="20"/>
+                <w:szCs w:val="20"/>
+              </w:rPr>
+              <w:t xml:space="preserve">Monitoreo 24/7</w:t>
+            </w:r>
+          </w:p>
+        </w:tc>
+        <w:tc>
+          <w:tcPr>
+            <w:tcW w:type="dxa" w:w="6560"/>
+            <w:shd w:fill="EEF1F6" w:val="clear"/>
+            <w:tcMar>
+              <w:top w:type="dxa" w:w="100"/>
+              <w:left w:type="dxa" w:w="120"/>
+              <w:bottom w:type="dxa" w:w="100"/>
+              <w:right w:type="dxa" w:w="120"/>
+            </w:tcMar>
+          </w:tcPr>
+          <w:p>
+            <w:r>
+              <w:rPr>
+                <w:sz w:val="20"/>
+                <w:szCs w:val="20"/>
+              </w:rPr>
+              <w:t xml:space="preserve">Supervisión continua, las 24 horas del día los 7 días de la semana, del estado del sistema instalado y de las señales que emite.</w:t>
+            </w:r>
+          </w:p>
+        </w:tc>
+      </w:tr>
+      <w:tr>
+        <w:trPr>
+          <w:cantSplit/>
+        </w:trPr>
+        <w:tc>
+          <w:tcPr>
+            <w:tcW w:type="dxa" w:w="2800"/>
+            <w:shd w:fill="FFFFFF" w:val="clear"/>
+            <w:tcMar>
+              <w:top w:type="dxa" w:w="100"/>
+              <w:left w:type="dxa" w:w="120"/>
+              <w:bottom w:type="dxa" w:w="100"/>
+              <w:right w:type="dxa" w:w="120"/>
+            </w:tcMar>
+          </w:tcPr>
+          <w:p>
+            <w:r>
+              <w:rPr>
+                <w:b/>
+                <w:bCs/>
+                <w:sz w:val="20"/>
+                <w:szCs w:val="20"/>
+              </w:rPr>
+              <w:t xml:space="preserve">Móvil de Acuda / SP Acuda</w:t>
+            </w:r>
+          </w:p>
+        </w:tc>
+        <w:tc>
+          <w:tcPr>
+            <w:tcW w:type="dxa" w:w="6560"/>
+            <w:shd w:fill="FFFFFF" w:val="clear"/>
+            <w:tcMar>
+              <w:top w:type="dxa" w:w="100"/>
+              <w:left w:type="dxa" w:w="120"/>
+              <w:bottom w:type="dxa" w:w="100"/>
+              <w:right w:type="dxa" w:w="120"/>
+            </w:tcMar>
+          </w:tcPr>
+          <w:p>
+            <w:r>
+              <w:rPr>
+                <w:sz w:val="20"/>
+                <w:szCs w:val="20"/>
+              </w:rPr>
+              <w:t xml:space="preserve">Móvil propio de SP que se dirige al domicilio o local ante un evento confirmado, dentro de su zona de cobertura (La Plata, Gonnet, City Bell y Villa Elisa).</w:t>
+            </w:r>
+          </w:p>
+        </w:tc>
+      </w:tr>
+      <w:tr>
+        <w:trPr>
+          <w:cantSplit/>
+        </w:trPr>
+        <w:tc>
+          <w:tcPr>
+            <w:tcW w:type="dxa" w:w="2800"/>
+            <w:shd w:fill="EEF1F6" w:val="clear"/>
+            <w:tcMar>
+              <w:top w:type="dxa" w:w="100"/>
+              <w:left w:type="dxa" w:w="120"/>
+              <w:bottom w:type="dxa" w:w="100"/>
+              <w:right w:type="dxa" w:w="120"/>
+            </w:tcMar>
+          </w:tcPr>
+          <w:p>
+            <w:r>
+              <w:rPr>
+                <w:b/>
+                <w:bCs/>
+                <w:sz w:val="20"/>
+                <w:szCs w:val="20"/>
+              </w:rPr>
+              <w:t xml:space="preserve">Panel de alarma</w:t>
+            </w:r>
+          </w:p>
+        </w:tc>
+        <w:tc>
+          <w:tcPr>
+            <w:tcW w:type="dxa" w:w="6560"/>
+            <w:shd w:fill="EEF1F6" w:val="clear"/>
+            <w:tcMar>
+              <w:top w:type="dxa" w:w="100"/>
+              <w:left w:type="dxa" w:w="120"/>
+              <w:bottom w:type="dxa" w:w="100"/>
+              <w:right w:type="dxa" w:w="120"/>
+            </w:tcMar>
+          </w:tcPr>
+          <w:p>
+            <w:r>
+              <w:rPr>
+                <w:sz w:val="20"/>
+                <w:szCs w:val="20"/>
+              </w:rPr>
+              <w:t xml:space="preserve">Unidad central del sistema de alarma, instalada en el domicilio o local, a la que se conectan los sensores y que se comunica con la central de monitoreo.</w:t>
+            </w:r>
+          </w:p>
+        </w:tc>
+      </w:tr>
+      <w:tr>
+        <w:trPr>
+          <w:cantSplit/>
+        </w:trPr>
+        <w:tc>
+          <w:tcPr>
+            <w:tcW w:type="dxa" w:w="2800"/>
+            <w:shd w:fill="FFFFFF" w:val="clear"/>
+            <w:tcMar>
+              <w:top w:type="dxa" w:w="100"/>
+              <w:left w:type="dxa" w:w="120"/>
+              <w:bottom w:type="dxa" w:w="100"/>
+              <w:right w:type="dxa" w:w="120"/>
+            </w:tcMar>
+          </w:tcPr>
+          <w:p>
+            <w:r>
+              <w:rPr>
+                <w:b/>
+                <w:bCs/>
+                <w:sz w:val="20"/>
+                <w:szCs w:val="20"/>
+              </w:rPr>
+              <w:t xml:space="preserve">Plazo mínimo de contrato</w:t>
+            </w:r>
+          </w:p>
+        </w:tc>
+        <w:tc>
+          <w:tcPr>
+            <w:tcW w:type="dxa" w:w="6560"/>
+            <w:shd w:fill="FFFFFF" w:val="clear"/>
+            <w:tcMar>
+              <w:top w:type="dxa" w:w="100"/>
+              <w:left w:type="dxa" w:w="120"/>
+              <w:bottom w:type="dxa" w:w="100"/>
+              <w:right w:type="dxa" w:w="120"/>
+            </w:tcMar>
+          </w:tcPr>
+          <w:p>
+            <w:r>
+              <w:rPr>
+                <w:sz w:val="20"/>
+                <w:szCs w:val="20"/>
+              </w:rPr>
+              <w:t xml:space="preserve">Período mínimo durante el cual el cliente se compromete a mantener el servicio contratado antes de poder darlo de baja sin condiciones adicionales.</w:t>
+            </w:r>
+          </w:p>
+        </w:tc>
+      </w:tr>
+      <w:tr>
+        <w:trPr>
+          <w:cantSplit/>
+        </w:trPr>
+        <w:tc>
+          <w:tcPr>
+            <w:tcW w:type="dxa" w:w="2800"/>
+            <w:shd w:fill="EEF1F6" w:val="clear"/>
+            <w:tcMar>
+              <w:top w:type="dxa" w:w="100"/>
+              <w:left w:type="dxa" w:w="120"/>
+              <w:bottom w:type="dxa" w:w="100"/>
+              <w:right w:type="dxa" w:w="120"/>
+            </w:tcMar>
+          </w:tcPr>
+          <w:p>
+            <w:r>
+              <w:rPr>
+                <w:b/>
+                <w:bCs/>
+                <w:sz w:val="20"/>
+                <w:szCs w:val="20"/>
+              </w:rPr>
+              <w:t xml:space="preserve">Segmento</w:t>
+            </w:r>
+          </w:p>
+        </w:tc>
+        <w:tc>
+          <w:tcPr>
+            <w:tcW w:type="dxa" w:w="6560"/>
+            <w:shd w:fill="EEF1F6" w:val="clear"/>
+            <w:tcMar>
+              <w:top w:type="dxa" w:w="100"/>
+              <w:left w:type="dxa" w:w="120"/>
+              <w:bottom w:type="dxa" w:w="100"/>
+              <w:right w:type="dxa" w:w="120"/>
+            </w:tcMar>
+          </w:tcPr>
+          <w:p>
+            <w:r>
+              <w:rPr>
+                <w:sz w:val="20"/>
+                <w:szCs w:val="20"/>
+              </w:rPr>
+              <w:t xml:space="preserve">Cada una de las cinco categorías en las que se organiza la oferta comercial de SP según el tipo de cliente: Hogar, Comercio, Obras, Consorcios y Edificios, y Empresas.</w:t>
+            </w:r>
+          </w:p>
+        </w:tc>
+      </w:tr>
+      <w:tr>
+        <w:trPr>
+          <w:cantSplit/>
+        </w:trPr>
+        <w:tc>
+          <w:tcPr>
+            <w:tcW w:type="dxa" w:w="2800"/>
+            <w:shd w:fill="FFFFFF" w:val="clear"/>
+            <w:tcMar>
+              <w:top w:type="dxa" w:w="100"/>
+              <w:left w:type="dxa" w:w="120"/>
+              <w:bottom w:type="dxa" w:w="100"/>
+              <w:right w:type="dxa" w:w="120"/>
+            </w:tcMar>
+          </w:tcPr>
+          <w:p>
+            <w:r>
+              <w:rPr>
+                <w:b/>
+                <w:bCs/>
+                <w:sz w:val="20"/>
+                <w:szCs w:val="20"/>
+              </w:rPr>
+              <w:t xml:space="preserve">Sensor infrarrojo</w:t>
+            </w:r>
+          </w:p>
+        </w:tc>
+        <w:tc>
+          <w:tcPr>
+            <w:tcW w:type="dxa" w:w="6560"/>
+            <w:shd w:fill="FFFFFF" w:val="clear"/>
+            <w:tcMar>
+              <w:top w:type="dxa" w:w="100"/>
+              <w:left w:type="dxa" w:w="120"/>
+              <w:bottom w:type="dxa" w:w="100"/>
+              <w:right w:type="dxa" w:w="120"/>
+            </w:tcMar>
+          </w:tcPr>
+          <w:p>
+            <w:r>
+              <w:rPr>
+                <w:sz w:val="20"/>
+                <w:szCs w:val="20"/>
+              </w:rPr>
+              <w:t xml:space="preserve">Dispositivo que detecta movimiento dentro de un área mediante la variación de calor (infrarrojo), utilizado en interiores y exteriores.</w:t>
+            </w:r>
+          </w:p>
+        </w:tc>
+      </w:tr>
+      <w:tr>
+        <w:trPr>
+          <w:cantSplit/>
+        </w:trPr>
+        <w:tc>
+          <w:tcPr>
+            <w:tcW w:type="dxa" w:w="2800"/>
+            <w:shd w:fill="EEF1F6" w:val="clear"/>
+            <w:tcMar>
+              <w:top w:type="dxa" w:w="100"/>
+              <w:left w:type="dxa" w:w="120"/>
+              <w:bottom w:type="dxa" w:w="100"/>
+              <w:right w:type="dxa" w:w="120"/>
+            </w:tcMar>
+          </w:tcPr>
+          <w:p>
+            <w:r>
+              <w:rPr>
+                <w:b/>
+                <w:bCs/>
+                <w:sz w:val="20"/>
+                <w:szCs w:val="20"/>
+              </w:rPr>
+              <w:t xml:space="preserve">Servicio técnico</w:t>
+            </w:r>
+          </w:p>
+        </w:tc>
+        <w:tc>
+          <w:tcPr>
+            <w:tcW w:type="dxa" w:w="6560"/>
+            <w:shd w:fill="EEF1F6" w:val="clear"/>
+            <w:tcMar>
+              <w:top w:type="dxa" w:w="100"/>
+              <w:left w:type="dxa" w:w="120"/>
+              <w:bottom w:type="dxa" w:w="100"/>
+              <w:right w:type="dxa" w:w="120"/>
+            </w:tcMar>
+          </w:tcPr>
+          <w:p>
+            <w:r>
+              <w:rPr>
+                <w:sz w:val="20"/>
+                <w:szCs w:val="20"/>
+              </w:rPr>
+              <w:t xml:space="preserve">Área de soporte que resuelve problemas del sistema instalado, de forma remota o presencial, cuando el cliente lo requiere.</w:t>
+            </w:r>
+          </w:p>
+        </w:tc>
+      </w:tr>
+      <w:tr>
+        <w:trPr>
+          <w:cantSplit/>
+        </w:trPr>
+        <w:tc>
+          <w:tcPr>
+            <w:tcW w:type="dxa" w:w="2800"/>
+            <w:shd w:fill="FFFFFF" w:val="clear"/>
+            <w:tcMar>
+              <w:top w:type="dxa" w:w="100"/>
+              <w:left w:type="dxa" w:w="120"/>
+              <w:bottom w:type="dxa" w:w="100"/>
+              <w:right w:type="dxa" w:w="120"/>
+            </w:tcMar>
+          </w:tcPr>
+          <w:p>
+            <w:r>
+              <w:rPr>
+                <w:b/>
+                <w:bCs/>
+                <w:sz w:val="20"/>
+                <w:szCs w:val="20"/>
+              </w:rPr>
+              <w:t xml:space="preserve">Servicio transversal</w:t>
+            </w:r>
+          </w:p>
+        </w:tc>
+        <w:tc>
+          <w:tcPr>
+            <w:tcW w:type="dxa" w:w="6560"/>
+            <w:shd w:fill="FFFFFF" w:val="clear"/>
+            <w:tcMar>
+              <w:top w:type="dxa" w:w="100"/>
+              <w:left w:type="dxa" w:w="120"/>
+              <w:bottom w:type="dxa" w:w="100"/>
+              <w:right w:type="dxa" w:w="120"/>
+            </w:tcMar>
+          </w:tcPr>
+          <w:p>
+            <w:r>
+              <w:rPr>
+                <w:sz w:val="20"/>
+                <w:szCs w:val="20"/>
+              </w:rPr>
+              <w:t xml:space="preserve">Capacidad o prestación de SP que no se vende como servicio independiente, sino que forma parte del valor de cualquier servicio contratado (ej. Monitoreo 24/7, Atención al cliente).</w:t>
+            </w:r>
+          </w:p>
+        </w:tc>
+      </w:tr>
+      <w:tr>
+        <w:trPr>
+          <w:cantSplit/>
+        </w:trPr>
+        <w:tc>
+          <w:tcPr>
+            <w:tcW w:type="dxa" w:w="2800"/>
+            <w:shd w:fill="EEF1F6" w:val="clear"/>
+            <w:tcMar>
+              <w:top w:type="dxa" w:w="100"/>
+              <w:left w:type="dxa" w:w="120"/>
+              <w:bottom w:type="dxa" w:w="100"/>
+              <w:right w:type="dxa" w:w="120"/>
+            </w:tcMar>
+          </w:tcPr>
+          <w:p>
+            <w:r>
+              <w:rPr>
+                <w:b/>
+                <w:bCs/>
+                <w:sz w:val="20"/>
+                <w:szCs w:val="20"/>
+              </w:rPr>
+              <w:t xml:space="preserve">Tótem</w:t>
+            </w:r>
+          </w:p>
+        </w:tc>
+        <w:tc>
+          <w:tcPr>
+            <w:tcW w:type="dxa" w:w="6560"/>
+            <w:shd w:fill="EEF1F6" w:val="clear"/>
+            <w:tcMar>
+              <w:top w:type="dxa" w:w="100"/>
+              <w:left w:type="dxa" w:w="120"/>
+              <w:bottom w:type="dxa" w:w="100"/>
+              <w:right w:type="dxa" w:w="120"/>
+            </w:tcMar>
+          </w:tcPr>
+          <w:p>
+            <w:r>
+              <w:rPr>
+                <w:sz w:val="20"/>
+                <w:szCs w:val="20"/>
+              </w:rPr>
+              <w:t xml:space="preserve">Estructura autónoma y reubicable que integra cámara, sensor, sirena y panel de alarma en una sola unidad, pensada para obras y sitios temporales.</w:t>
+            </w:r>
+          </w:p>
+        </w:tc>
+      </w:tr>
+      <w:tr>
+        <w:trPr>
+          <w:cantSplit/>
+        </w:trPr>
+        <w:tc>
+          <w:tcPr>
+            <w:tcW w:type="dxa" w:w="2800"/>
+            <w:shd w:fill="FFFFFF" w:val="clear"/>
+            <w:tcMar>
+              <w:top w:type="dxa" w:w="100"/>
+              <w:left w:type="dxa" w:w="120"/>
+              <w:bottom w:type="dxa" w:w="100"/>
+              <w:right w:type="dxa" w:w="120"/>
+            </w:tcMar>
+          </w:tcPr>
+          <w:p>
+            <w:r>
+              <w:rPr>
+                <w:b/>
+                <w:bCs/>
+                <w:sz w:val="20"/>
+                <w:szCs w:val="20"/>
+              </w:rPr>
+              <w:t xml:space="preserve">Venta directa</w:t>
+            </w:r>
+          </w:p>
+        </w:tc>
+        <w:tc>
+          <w:tcPr>
+            <w:tcW w:type="dxa" w:w="6560"/>
+            <w:shd w:fill="FFFFFF" w:val="clear"/>
+            <w:tcMar>
+              <w:top w:type="dxa" w:w="100"/>
+              <w:left w:type="dxa" w:w="120"/>
+              <w:bottom w:type="dxa" w:w="100"/>
+              <w:right w:type="dxa" w:w="120"/>
+            </w:tcMar>
+          </w:tcPr>
+          <w:p>
+            <w:r>
+              <w:rPr>
+                <w:sz w:val="20"/>
+                <w:szCs w:val="20"/>
+              </w:rPr>
+              <w:t xml:space="preserve">Modalidad en la que el cliente compra el equipamiento y pasa a ser su propietario desde la instalación, a diferencia del comodato.</w:t>
+            </w:r>
+          </w:p>
+        </w:tc>
+      </w:tr>
+      <w:tr>
+        <w:trPr>
+          <w:cantSplit/>
+        </w:trPr>
+        <w:tc>
+          <w:tcPr>
+            <w:tcW w:type="dxa" w:w="2800"/>
+            <w:shd w:fill="EEF1F6" w:val="clear"/>
+            <w:tcMar>
+              <w:top w:type="dxa" w:w="100"/>
+              <w:left w:type="dxa" w:w="120"/>
+              <w:bottom w:type="dxa" w:w="100"/>
+              <w:right w:type="dxa" w:w="120"/>
+            </w:tcMar>
+          </w:tcPr>
+          <w:p>
+            <w:r>
+              <w:rPr>
+                <w:b/>
+                <w:bCs/>
+                <w:sz w:val="20"/>
+                <w:szCs w:val="20"/>
+              </w:rPr>
+              <w:t xml:space="preserve">Videovigilancia</w:t>
+            </w:r>
+          </w:p>
+        </w:tc>
+        <w:tc>
+          <w:tcPr>
+            <w:tcW w:type="dxa" w:w="6560"/>
+            <w:shd w:fill="EEF1F6" w:val="clear"/>
+            <w:tcMar>
+              <w:top w:type="dxa" w:w="100"/>
+              <w:left w:type="dxa" w:w="120"/>
+              <w:bottom w:type="dxa" w:w="100"/>
+              <w:right w:type="dxa" w:w="120"/>
+            </w:tcMar>
+          </w:tcPr>
+          <w:p>
+            <w:r>
+              <w:rPr>
+                <w:sz w:val="20"/>
+                <w:szCs w:val="20"/>
+              </w:rPr>
+              <w:t xml:space="preserve">Servicio de instalación de cámaras con grabación (continua o por evento) y acceso remoto a las imágenes desde el celular.</w:t>
+            </w:r>
+          </w:p>
+        </w:tc>
+      </w:tr>
+      <w:tr>
+        <w:trPr>
+          <w:cantSplit/>
+        </w:trPr>
+        <w:tc>
+          <w:tcPr>
+            <w:tcW w:type="dxa" w:w="2800"/>
+            <w:shd w:fill="FFFFFF" w:val="clear"/>
+            <w:tcMar>
+              <w:top w:type="dxa" w:w="100"/>
+              <w:left w:type="dxa" w:w="120"/>
+              <w:bottom w:type="dxa" w:w="100"/>
+              <w:right w:type="dxa" w:w="120"/>
+            </w:tcMar>
+          </w:tcPr>
+          <w:p>
+            <w:r>
+              <w:rPr>
+                <w:b/>
+                <w:bCs/>
+                <w:sz w:val="20"/>
+                <w:szCs w:val="20"/>
+              </w:rPr>
+              <w:t xml:space="preserve">Videoverificación</w:t>
+            </w:r>
+          </w:p>
+        </w:tc>
+        <w:tc>
+          <w:tcPr>
+            <w:tcW w:type="dxa" w:w="6560"/>
+            <w:shd w:fill="FFFFFF" w:val="clear"/>
+            <w:tcMar>
+              <w:top w:type="dxa" w:w="100"/>
+              <w:left w:type="dxa" w:w="120"/>
+              <w:bottom w:type="dxa" w:w="100"/>
+              <w:right w:type="dxa" w:w="120"/>
+            </w:tcMar>
+          </w:tcPr>
+          <w:p>
+            <w:r>
+              <w:rPr>
+                <w:sz w:val="20"/>
+                <w:szCs w:val="20"/>
+              </w:rPr>
+              <w:t xml:space="preserve">Verificación visual del evento desde la central antes de disparar una respuesta, usando las cámaras del servicio de Videovigilancia contratado.</w:t>
+            </w:r>
+          </w:p>
+        </w:tc>
+      </w:tr>
+      <w:tr>
+        <w:trPr>
+          <w:cantSplit/>
+        </w:trPr>
+        <w:tc>
+          <w:tcPr>
+            <w:tcW w:type="dxa" w:w="2800"/>
+            <w:shd w:fill="EEF1F6" w:val="clear"/>
+            <w:tcMar>
+              <w:top w:type="dxa" w:w="100"/>
+              <w:left w:type="dxa" w:w="120"/>
+              <w:bottom w:type="dxa" w:w="100"/>
+              <w:right w:type="dxa" w:w="120"/>
+            </w:tcMar>
+          </w:tcPr>
+          <w:p>
+            <w:r>
+              <w:rPr>
+                <w:b/>
+                <w:bCs/>
+                <w:sz w:val="20"/>
+                <w:szCs w:val="20"/>
+              </w:rPr>
+              <w:t xml:space="preserve">Vigilancia presencial</w:t>
+            </w:r>
+          </w:p>
+        </w:tc>
+        <w:tc>
+          <w:tcPr>
+            <w:tcW w:type="dxa" w:w="6560"/>
+            <w:shd w:fill="EEF1F6" w:val="clear"/>
+            <w:tcMar>
+              <w:top w:type="dxa" w:w="100"/>
+              <w:left w:type="dxa" w:w="120"/>
+              <w:bottom w:type="dxa" w:w="100"/>
+              <w:right w:type="dxa" w:w="120"/>
+            </w:tcMar>
+          </w:tcPr>
+          <w:p>
+            <w:r>
+              <w:rPr>
+                <w:sz w:val="20"/>
+                <w:szCs w:val="20"/>
+              </w:rPr>
+              <w:t xml:space="preserve">Servicio de personal de seguridad físicamente presente en el sitio, en comunicación permanente con la central de monitoreo.</w:t>
+            </w:r>
+          </w:p>
+        </w:tc>
+      </w:tr>
+    </w:tbl>
     <w:sectPr>
       <w:pgSz w:w="12240" w:h="15840" w:orient="portrait"/>
       <w:pgMar w:top="1080" w:right="1080" w:bottom="1080" w:left="1080" w:header="708" w:footer="708" w:gutter="0"/>

</xml_diff>

<commit_message>
Modificacion mapa de servicios
</commit_message>
<xml_diff>
--- a/Mapa_de_Servicios_SP.docx
+++ b/Mapa_de_Servicios_SP.docx
@@ -41,7 +41,7 @@
           <w:sz w:val="21"/>
           <w:szCs w:val="21"/>
         </w:rPr>
-        <w:t>Versión V1.6 — Revisión 5/7: se agrega Glosario (final del documento) y Cancelación "[A completar]" al pie de cada uno de los 5 servicios principales (uno por segmento)</w:t>
+        <w:t>Versión V1.7 — Revisión 6/7: en Hogar, se unifican Alarma monitoreada y Videovigilancia en un solo servicio destacado</w:t>
       </w:r>
     </w:p>
     <w:p>
@@ -69,7 +69,7 @@
           <w:sz w:val="18"/>
           <w:szCs w:val="18"/>
         </w:rPr>
-        <w:t>Fuente: contenido vigente en pages/mapa-servicios.html (js/versiones/mapa-v1.5.js) del repositorio Web Interna SP.</w:t>
+        <w:t>Fuente: contenido vigente en pages/mapa-servicios.html (js/versiones/mapa-v1.7.js) del repositorio Web Interna SP.</w:t>
       </w:r>
     </w:p>
     <w:p>
@@ -264,7 +264,7 @@
                 <w:sz w:val="20"/>
                 <w:szCs w:val="20"/>
               </w:rPr>
-              <w:t xml:space="preserve">Alarma monitoreada</w:t>
+              <w:t>Alarma monitoreada + Videovigilancia</w:t>
             </w:r>
           </w:p>
         </w:tc>
@@ -285,7 +285,7 @@
                 <w:sz w:val="20"/>
                 <w:szCs w:val="20"/>
               </w:rPr>
-              <w:t xml:space="preserve">Detección y respuesta 24/7</w:t>
+              <w:t>Detección, respuesta y video en un solo servicio, las 24 horas</w:t>
             </w:r>
           </w:p>
         </w:tc>
@@ -306,7 +306,7 @@
                 <w:sz w:val="20"/>
                 <w:szCs w:val="20"/>
               </w:rPr>
-              <w:t xml:space="preserve">La seguridad del hogar en todo momento: ante cualquier intento de intrusión o emergencia, tanto cuando estás en casa como cuando no estás.</w:t>
+              <w:t>La seguridad del hogar en todo momento: detectar cualquier intento de intrusión o emergencia y, además, poder ver qué está pasando en tiempo real o revisar lo grabado ante un incidente — tanto estando en casa como en tu ausencia.</w:t>
             </w:r>
           </w:p>
         </w:tc>
@@ -331,7 +331,7 @@
                 <w:sz w:val="20"/>
                 <w:szCs w:val="20"/>
               </w:rPr>
-              <w:t xml:space="preserve">Videovigilancia</w:t>
+              <w:t xml:space="preserve">Videoverificación</w:t>
             </w:r>
           </w:p>
         </w:tc>
@@ -352,7 +352,7 @@
                 <w:sz w:val="20"/>
                 <w:szCs w:val="20"/>
               </w:rPr>
-              <w:t xml:space="preserve">Monitoreo visual interior y exterior</w:t>
+              <w:t xml:space="preserve">Confirmación visual del evento desde la central</w:t>
             </w:r>
           </w:p>
         </w:tc>
@@ -373,7 +373,7 @@
                 <w:sz w:val="20"/>
                 <w:szCs w:val="20"/>
               </w:rPr>
-              <w:t xml:space="preserve">No poder ver qué ocurre en el hogar en tiempo real, o no tener registro visual ante un incidente.</w:t>
+              <w:t xml:space="preserve">Saber con certeza qué está pasando ante una alerta, en vez de depender de que alguien esté disponible para confirmarlo.</w:t>
             </w:r>
           </w:p>
         </w:tc>
@@ -398,7 +398,7 @@
                 <w:sz w:val="20"/>
                 <w:szCs w:val="20"/>
               </w:rPr>
-              <w:t xml:space="preserve">Videoverificación</w:t>
+              <w:t xml:space="preserve">Cerco eléctrico</w:t>
             </w:r>
           </w:p>
         </w:tc>
@@ -419,7 +419,7 @@
                 <w:sz w:val="20"/>
                 <w:szCs w:val="20"/>
               </w:rPr>
-              <w:t xml:space="preserve">Confirmación visual del evento desde la central</w:t>
+              <w:t xml:space="preserve">Protección perimetral activa</w:t>
             </w:r>
           </w:p>
         </w:tc>
@@ -427,73 +427,6 @@
           <w:tcPr>
             <w:tcW w:type="dxa" w:w="4360"/>
             <w:shd w:fill="FFFFFF" w:val="clear"/>
-            <w:tcMar>
-              <w:top w:type="dxa" w:w="100"/>
-              <w:left w:type="dxa" w:w="120"/>
-              <w:bottom w:type="dxa" w:w="100"/>
-              <w:right w:type="dxa" w:w="120"/>
-            </w:tcMar>
-          </w:tcPr>
-          <w:p>
-            <w:r>
-              <w:rPr>
-                <w:sz w:val="20"/>
-                <w:szCs w:val="20"/>
-              </w:rPr>
-              <w:t xml:space="preserve">Saber con certeza qué está pasando ante una alerta, en vez de depender de que alguien esté disponible para confirmarlo.</w:t>
-            </w:r>
-          </w:p>
-        </w:tc>
-      </w:tr>
-      <w:tr>
-        <w:tc>
-          <w:tcPr>
-            <w:tcW w:type="dxa" w:w="2400"/>
-            <w:shd w:fill="EEF1F6" w:val="clear"/>
-            <w:tcMar>
-              <w:top w:type="dxa" w:w="100"/>
-              <w:left w:type="dxa" w:w="120"/>
-              <w:bottom w:type="dxa" w:w="100"/>
-              <w:right w:type="dxa" w:w="120"/>
-            </w:tcMar>
-          </w:tcPr>
-          <w:p>
-            <w:r>
-              <w:rPr>
-                <w:b/>
-                <w:bCs/>
-                <w:sz w:val="20"/>
-                <w:szCs w:val="20"/>
-              </w:rPr>
-              <w:t xml:space="preserve">Cerco eléctrico</w:t>
-            </w:r>
-          </w:p>
-        </w:tc>
-        <w:tc>
-          <w:tcPr>
-            <w:tcW w:type="dxa" w:w="2600"/>
-            <w:shd w:fill="EEF1F6" w:val="clear"/>
-            <w:tcMar>
-              <w:top w:type="dxa" w:w="100"/>
-              <w:left w:type="dxa" w:w="120"/>
-              <w:bottom w:type="dxa" w:w="100"/>
-              <w:right w:type="dxa" w:w="120"/>
-            </w:tcMar>
-          </w:tcPr>
-          <w:p>
-            <w:r>
-              <w:rPr>
-                <w:sz w:val="20"/>
-                <w:szCs w:val="20"/>
-              </w:rPr>
-              <w:t xml:space="preserve">Protección perimetral activa</w:t>
-            </w:r>
-          </w:p>
-        </w:tc>
-        <w:tc>
-          <w:tcPr>
-            <w:tcW w:type="dxa" w:w="4360"/>
-            <w:shd w:fill="EEF1F6" w:val="clear"/>
             <w:tcMar>
               <w:top w:type="dxa" w:w="100"/>
               <w:left w:type="dxa" w:w="120"/>
@@ -530,7 +463,7 @@
           <w:sz w:val="24"/>
           <w:szCs w:val="24"/>
         </w:rPr>
-        <w:t xml:space="preserve">Alarma monitoreada — Detección y respuesta 24/7</w:t>
+        <w:t xml:space="preserve">Alarma monitoreada + Videovigilancia — Detección, respuesta y video en un solo servicio, las 24 horas</w:t>
       </w:r>
     </w:p>
     <w:p>
@@ -561,7 +494,7 @@
           <w:sz w:val="21"/>
           <w:szCs w:val="21"/>
         </w:rPr>
-        <w:t xml:space="preserve">Instalación del sistema en el domicilio</w:t>
+        <w:t xml:space="preserve">Instalación del sistema de alarma y de cámaras interiores y/o exteriores</w:t>
       </w:r>
     </w:p>
     <w:p>
@@ -578,7 +511,7 @@
           <w:sz w:val="21"/>
           <w:szCs w:val="21"/>
         </w:rPr>
-        <w:t xml:space="preserve">Monitoreo 24/7 desde la central SP</w:t>
+        <w:t xml:space="preserve">Monitoreo 24/7 desde la central SP, con acceso a las imágenes ante cualquier evento</w:t>
       </w:r>
     </w:p>
     <w:p>
@@ -612,7 +545,7 @@
           <w:sz w:val="21"/>
           <w:szCs w:val="21"/>
         </w:rPr>
-        <w:t xml:space="preserve">Control y armado/desarmado desde el celular (App)</w:t>
+        <w:t xml:space="preserve">Grabación continua con almacenamiento local</w:t>
       </w:r>
     </w:p>
     <w:p>
@@ -629,7 +562,7 @@
           <w:sz w:val="21"/>
           <w:szCs w:val="21"/>
         </w:rPr>
-        <w:t xml:space="preserve">Botón de pánico</w:t>
+        <w:t xml:space="preserve">Control, armado/desarmado y acceso a cámaras desde el celular (App)</w:t>
       </w:r>
     </w:p>
     <w:p>
@@ -646,99 +579,7 @@
           <w:sz w:val="21"/>
           <w:szCs w:val="21"/>
         </w:rPr>
-        <w:t xml:space="preserve">Aviso ante corte de luz</w:t>
-      </w:r>
-    </w:p>
-    <w:p>
-      <w:pPr>
-        <w:spacing w:after="100"/>
-      </w:pPr>
-      <w:r>
-        <w:rPr>
-          <w:b/>
-          <w:bCs/>
-          <w:sz w:val="21"/>
-          <w:szCs w:val="21"/>
-        </w:rPr>
-        <w:t xml:space="preserve">Facturación: </w:t>
-      </w:r>
-      <w:r>
-        <w:rPr>
-          <w:sz w:val="21"/>
-          <w:szCs w:val="21"/>
-        </w:rPr>
-        <w:t xml:space="preserve">Cargo de instalación único + abono mensual de monitoreo. Equipamiento en comodato: el mantenimiento es responsabilidad de SP.</w:t>
-      </w:r>
-    </w:p>
-    <w:p>
-      <w:pPr>
-        <w:spacing w:after="100"/>
-      </w:pPr>
-      <w:r>
-        <w:rPr>
-          <w:b/>
-          <w:bCs/>
-          <w:sz w:val="21"/>
-          <w:szCs w:val="21"/>
-        </w:rPr>
-        <w:t xml:space="preserve">Diferencial: </w:t>
-      </w:r>
-      <w:r>
-        <w:rPr>
-          <w:sz w:val="21"/>
-          <w:szCs w:val="21"/>
-        </w:rPr>
-        <w:t xml:space="preserve">Es un servicio de seguridad que no depende del usuario. La central actúa de forma autónoma ante cualquier emergencia aunque no se pueda ubicar al cliente.</w:t>
-      </w:r>
-    </w:p>
-    <w:p>
-      <w:pPr>
-        <w:spacing w:after="100"/>
-      </w:pPr>
-      <w:r>
-        <w:rPr>
-          <w:b/>
-          <w:bCs/>
-          <w:sz w:val="21"/>
-          <w:szCs w:val="21"/>
-        </w:rPr>
-        <w:t xml:space="preserve">Cancelación: </w:t>
-      </w:r>
-      <w:r>
-        <w:rPr>
-          <w:sz w:val="21"/>
-          <w:szCs w:val="21"/>
-        </w:rPr>
-        <w:t xml:space="preserve">[A completar]</w:t>
-      </w:r>
-    </w:p>
-    <w:p>
-      <w:pPr>
-        <w:spacing w:after="100" w:before="240"/>
-      </w:pPr>
-      <w:r>
-        <w:rPr>
-          <w:b/>
-          <w:bCs/>
-          <w:color w:val="1B2A4A"/>
-          <w:sz w:val="24"/>
-          <w:szCs w:val="24"/>
-        </w:rPr>
-        <w:t xml:space="preserve">Videovigilancia — Monitoreo visual interior y exterior</w:t>
-      </w:r>
-    </w:p>
-    <w:p>
-      <w:pPr>
-        <w:spacing w:after="80"/>
-      </w:pPr>
-      <w:r>
-        <w:rPr>
-          <w:b/>
-          <w:bCs/>
-          <w:sz w:val="21"/>
-          <w:szCs w:val="21"/>
-        </w:rPr>
-        <w:t xml:space="preserve">Incluye:</w:t>
+        <w:t xml:space="preserve">Botón de pánico</w:t>
       </w:r>
     </w:p>
     <w:p>
@@ -755,7 +596,99 @@
           <w:sz w:val="21"/>
           <w:szCs w:val="21"/>
         </w:rPr>
-        <w:t xml:space="preserve">Instalación de cámaras interiores y/o exteriores</w:t>
+        <w:t xml:space="preserve">Aviso ante corte de luz</w:t>
+      </w:r>
+    </w:p>
+    <w:p>
+      <w:pPr>
+        <w:spacing w:after="100"/>
+      </w:pPr>
+      <w:r>
+        <w:rPr>
+          <w:b/>
+          <w:bCs/>
+          <w:sz w:val="21"/>
+          <w:szCs w:val="21"/>
+        </w:rPr>
+        <w:t xml:space="preserve">Facturación: </w:t>
+      </w:r>
+      <w:r>
+        <w:rPr>
+          <w:sz w:val="21"/>
+          <w:szCs w:val="21"/>
+        </w:rPr>
+        <w:t xml:space="preserve">Cargo de instalación único + abono mensual único que incluye monitoreo de alarma y videovigilancia. Dos modalidades de equipamiento: comodato — para kit de instalación básico, el equipo es propiedad de SP y el mantenimiento corre por su cuenta — o venta directa, donde el cliente es propietario del equipo desde la instalación.</w:t>
+      </w:r>
+    </w:p>
+    <w:p>
+      <w:pPr>
+        <w:spacing w:after="100"/>
+      </w:pPr>
+      <w:r>
+        <w:rPr>
+          <w:b/>
+          <w:bCs/>
+          <w:sz w:val="21"/>
+          <w:szCs w:val="21"/>
+        </w:rPr>
+        <w:t xml:space="preserve">Diferencial: </w:t>
+      </w:r>
+      <w:r>
+        <w:rPr>
+          <w:sz w:val="21"/>
+          <w:szCs w:val="21"/>
+        </w:rPr>
+        <w:t xml:space="preserve">Es un servicio de seguridad integral que no depende del usuario: la central detecta, ve y actúa de forma autónoma ante cualquier emergencia, aunque no se pueda ubicar al cliente. Ante una alerta, la central puede ver las imágenes en tiempo real y responder con información concreta, no solo con una notificación.</w:t>
+      </w:r>
+    </w:p>
+    <w:p>
+      <w:pPr>
+        <w:spacing w:after="100"/>
+      </w:pPr>
+      <w:r>
+        <w:rPr>
+          <w:b/>
+          <w:bCs/>
+          <w:sz w:val="21"/>
+          <w:szCs w:val="21"/>
+        </w:rPr>
+        <w:t xml:space="preserve">Cancelación: </w:t>
+      </w:r>
+      <w:r>
+        <w:rPr>
+          <w:sz w:val="21"/>
+          <w:szCs w:val="21"/>
+        </w:rPr>
+        <w:t xml:space="preserve">[A completar]</w:t>
+      </w:r>
+    </w:p>
+    <w:p>
+      <w:pPr>
+        <w:spacing w:after="100" w:before="240"/>
+      </w:pPr>
+      <w:r>
+        <w:rPr>
+          <w:b/>
+          <w:bCs/>
+          <w:color w:val="1B2A4A"/>
+          <w:sz w:val="24"/>
+          <w:szCs w:val="24"/>
+        </w:rPr>
+        <w:t xml:space="preserve">Videoverificación — Confirmación visual del evento desde la central</w:t>
+      </w:r>
+    </w:p>
+    <w:p>
+      <w:pPr>
+        <w:spacing w:after="80"/>
+      </w:pPr>
+      <w:r>
+        <w:rPr>
+          <w:b/>
+          <w:bCs/>
+          <w:sz w:val="21"/>
+          <w:szCs w:val="21"/>
+        </w:rPr>
+        <w:t xml:space="preserve">Incluye:</w:t>
       </w:r>
     </w:p>
     <w:p>
@@ -772,7 +705,7 @@
           <w:sz w:val="21"/>
           <w:szCs w:val="21"/>
         </w:rPr>
-        <w:t xml:space="preserve">Grabación continua con almacenamiento local</w:t>
+        <w:t xml:space="preserve">Verificación visual desde la central ante cada alerta</w:t>
       </w:r>
     </w:p>
     <w:p>
@@ -789,78 +722,7 @@
           <w:sz w:val="21"/>
           <w:szCs w:val="21"/>
         </w:rPr>
-        <w:t xml:space="preserve">Acceso remoto a las imágenes desde el celular</w:t>
-      </w:r>
-    </w:p>
-    <w:p>
-      <w:pPr>
-        <w:spacing w:after="100"/>
-      </w:pPr>
-      <w:r>
-        <w:rPr>
-          <w:b/>
-          <w:bCs/>
-          <w:sz w:val="21"/>
-          <w:szCs w:val="21"/>
-        </w:rPr>
-        <w:t xml:space="preserve">Facturación: </w:t>
-      </w:r>
-      <w:r>
-        <w:rPr>
-          <w:sz w:val="21"/>
-          <w:szCs w:val="21"/>
-        </w:rPr>
-        <w:t xml:space="preserve">Cargo de instalación único + abono mensual de monitoreo.</w:t>
-      </w:r>
-    </w:p>
-    <w:p>
-      <w:pPr>
-        <w:spacing w:after="100"/>
-      </w:pPr>
-      <w:r>
-        <w:rPr>
-          <w:b/>
-          <w:bCs/>
-          <w:sz w:val="21"/>
-          <w:szCs w:val="21"/>
-        </w:rPr>
-        <w:t xml:space="preserve">Diferencial: </w:t>
-      </w:r>
-      <w:r>
-        <w:rPr>
-          <w:sz w:val="21"/>
-          <w:szCs w:val="21"/>
-        </w:rPr>
-        <w:t xml:space="preserve">Ante una alerta, la central puede ver las imágenes en tiempo real y actuar con información concreta, sin depender de la disponibilidad del cliente.</w:t>
-      </w:r>
-    </w:p>
-    <w:p>
-      <w:pPr>
-        <w:spacing w:after="100" w:before="240"/>
-      </w:pPr>
-      <w:r>
-        <w:rPr>
-          <w:b/>
-          <w:bCs/>
-          <w:color w:val="1B2A4A"/>
-          <w:sz w:val="24"/>
-          <w:szCs w:val="24"/>
-        </w:rPr>
-        <w:t xml:space="preserve">Videoverificación — Confirmación visual del evento desde la central</w:t>
-      </w:r>
-    </w:p>
-    <w:p>
-      <w:pPr>
-        <w:spacing w:after="80"/>
-      </w:pPr>
-      <w:r>
-        <w:rPr>
-          <w:b/>
-          <w:bCs/>
-          <w:sz w:val="21"/>
-          <w:szCs w:val="21"/>
-        </w:rPr>
-        <w:t xml:space="preserve">Incluye:</w:t>
+        <w:t xml:space="preserve">Confirmación del evento antes de disparar la respuesta</w:t>
       </w:r>
     </w:p>
     <w:p>
@@ -877,40 +739,6 @@
           <w:sz w:val="21"/>
           <w:szCs w:val="21"/>
         </w:rPr>
-        <w:t xml:space="preserve">Verificación visual desde la central ante cada alerta</w:t>
-      </w:r>
-    </w:p>
-    <w:p>
-      <w:pPr>
-        <w:pStyle w:val="ListParagraph"/>
-        <w:numPr>
-          <w:ilvl w:val="0"/>
-          <w:numId w:val="1"/>
-        </w:numPr>
-        <w:spacing w:after="60"/>
-      </w:pPr>
-      <w:r>
-        <w:rPr>
-          <w:sz w:val="21"/>
-          <w:szCs w:val="21"/>
-        </w:rPr>
-        <w:t xml:space="preserve">Confirmación del evento antes de disparar la respuesta</w:t>
-      </w:r>
-    </w:p>
-    <w:p>
-      <w:pPr>
-        <w:pStyle w:val="ListParagraph"/>
-        <w:numPr>
-          <w:ilvl w:val="0"/>
-          <w:numId w:val="1"/>
-        </w:numPr>
-        <w:spacing w:after="60"/>
-      </w:pPr>
-      <w:r>
-        <w:rPr>
-          <w:sz w:val="21"/>
-          <w:szCs w:val="21"/>
-        </w:rPr>
         <w:t xml:space="preserve">Reporte con información concreta a SP Acuda o a las fuerzas de seguridad</w:t>
       </w:r>
     </w:p>
@@ -932,7 +760,7 @@
           <w:sz w:val="21"/>
           <w:szCs w:val="21"/>
         </w:rPr>
-        <w:t xml:space="preserve">Incluido en el abono mensual del servicio de Videovigilancia contratado.</w:t>
+        <w:t xml:space="preserve">Incluido en el abono mensual del servicio de Alarma monitoreada + Videovigilancia contratado.</w:t>
       </w:r>
     </w:p>
     <w:p>
@@ -4575,7 +4403,7 @@
           <w:sz w:val="21"/>
           <w:szCs w:val="21"/>
         </w:rPr>
-        <w:t>Historial de revisiones del Mapa de Servicios tal como se registra en el código del portal (js/versiones/mapa-v1.0.js a mapa-v1.5.js).</w:t>
+        <w:t>Historial de revisiones del Mapa de Servicios tal como se registra en el código del portal (js/versiones/mapa-v1.0.js a mapa-v1.7.js — no existe mapa-v1.6.js: esa revisión fue exclusiva de este documento, ver tabla).</w:t>
       </w:r>
     </w:p>
     <w:tbl>
@@ -4946,9 +4774,55 @@
                 <w:bCs/>
                 <w:sz w:val="20"/>
                 <w:szCs w:val="20"/>
+              </w:rPr>
+              <w:t>V1.6</w:t>
+            </w:r>
+          </w:p>
+        </w:tc>
+        <w:tc>
+          <w:tcPr>
+            <w:tcW w:type="dxa" w:w="7800"/>
+            <w:shd w:fill="FFFFFF" w:val="clear"/>
+            <w:tcMar>
+              <w:top w:type="dxa" w:w="100"/>
+              <w:left w:type="dxa" w:w="120"/>
+              <w:bottom w:type="dxa" w:w="100"/>
+              <w:right w:type="dxa" w:w="120"/>
+            </w:tcMar>
+          </w:tcPr>
+          <w:p>
+            <w:r>
+              <w:rPr>
+                <w:sz w:val="20"/>
+                <w:szCs w:val="20"/>
+              </w:rPr>
+              <w:t>Revisión 5/7 — se agrega la sección "Glosario" (definiciones de términos técnicos y comerciales) al final del documento, y un renglón "Cancelación: [A completar]" al pie de cada uno de los 5 servicios principales (uno por segmento), pendiente de carga por Comercial/Legal. Cambio solo en este documento — no está reflejado en la web (js/versiones/mapa-v1.5.js sigue siendo la versión vigente en el portal).</w:t>
+            </w:r>
+          </w:p>
+        </w:tc>
+      </w:tr>
+      <w:tr>
+        <w:tc>
+          <w:tcPr>
+            <w:tcW w:type="dxa" w:w="1560"/>
+            <w:shd w:fill="FFFFFF" w:val="clear"/>
+            <w:tcMar>
+              <w:top w:type="dxa" w:w="100"/>
+              <w:left w:type="dxa" w:w="120"/>
+              <w:bottom w:type="dxa" w:w="100"/>
+              <w:right w:type="dxa" w:w="120"/>
+            </w:tcMar>
+          </w:tcPr>
+          <w:p>
+            <w:r>
+              <w:rPr>
+                <w:b/>
+                <w:bCs/>
+                <w:sz w:val="20"/>
+                <w:szCs w:val="20"/>
                 <w:color w:val="C0392B"/>
               </w:rPr>
-              <w:t>V1.6 (actual)</w:t>
+              <w:t>V1.7 (actual)</w:t>
             </w:r>
           </w:p>
         </w:tc>
@@ -4969,7 +4843,7 @@
                 <w:sz w:val="20"/>
                 <w:szCs w:val="20"/>
               </w:rPr>
-              <w:t>Revisión 5/7 — se agrega la sección "Glosario" (definiciones de términos técnicos y comerciales) al final del documento, y un renglón "Cancelación: [A completar]" al pie de cada uno de los 5 servicios principales (uno por segmento), pendiente de carga por Comercial/Legal. Cambio solo en este documento — no está reflejado en la web (js/versiones/mapa-v1.5.js sigue siendo la versión vigente en el portal).</w:t>
+              <w:t>Revisión 6/7 — en Hogar, se unifican "Alarma monitoreada" y "Videovigilancia" en un solo servicio destacado ("Alarma monitoreada + Videovigilancia"), primero en el orden; en la web ocupa una tarjeta de ancho completo en la grilla (flag "featured"). "Videoverificación" y "Cerco eléctrico" quedan igual, por separado. Cambio en docx y web (js/versiones/mapa-v1.7.js + mapa-servicios.js/css).</w:t>
             </w:r>
           </w:p>
         </w:tc>
@@ -4992,7 +4866,7 @@
           <w:sz w:val="21"/>
           <w:szCs w:val="21"/>
         </w:rPr>
-        <w:t>Nota: el contenido de los servicios (segmentos, tarjetas y transversales) refleja la versión v1.5 del portal, la más reciente cargada en el sitio a la fecha indicada. Las secciones "Glosario" y "Condiciones de cancelación", agregadas en la V1.6 de este documento, existen únicamente en este Word — no tienen todavía un equivalente en pages/mapa-servicios.html. Si el contenido de los servicios se actualiza en el sitio, este documento debe regenerarse para mantenerse alineado.</w:t>
+        <w:t>Nota: el contenido de los servicios (segmentos, tarjetas y transversales) refleja la versión v1.7 del portal, la más reciente cargada en el sitio a la fecha indicada — incluye la unificación de Alarma monitoreada y Videovigilancia en Hogar. El renglón "Cancelación: [A completar]" al pie de cada uno de los 5 servicios principales y la sección "Glosario" existen únicamente en este Word — no tienen todavía un equivalente en pages/mapa-servicios.html. Si el contenido de los servicios se actualiza en el sitio, este documento debe regenerarse para mantenerse alineado.</w:t>
       </w:r>
     </w:p>
     <w:p>

</xml_diff>

<commit_message>
modificaciones mapa de servicios
</commit_message>
<xml_diff>
--- a/Mapa_de_Servicios_SP.docx
+++ b/Mapa_de_Servicios_SP.docx
@@ -41,7 +41,7 @@
           <w:sz w:val="21"/>
           <w:szCs w:val="21"/>
         </w:rPr>
-        <w:t>Versión V1.11 — Revisión 10: se agrega el texto de introducción del segmento "Vigilancia presencial" (propuesto por Claude, aprobada la Opción B por Martin).</w:t>
+        <w:t>Versión V1.12 — Revisión 11: se renombra "App Ajax Security" a "APP para usuario final" (servicio transversal, descripción genérica multi-marca) y se ajusta la introducción de Consorcios y Edificios (se quita la mención a "depósitos").</w:t>
       </w:r>
     </w:p>
     <w:p>
@@ -69,7 +69,7 @@
           <w:sz w:val="18"/>
           <w:szCs w:val="18"/>
         </w:rPr>
-        <w:t>Fuente: contenido vigente en pages/mapa-servicios.html (js/versiones/mapa-v1.11.js) del repositorio Web Interna SP.</w:t>
+        <w:t>Fuente: contenido vigente en pages/mapa-servicios.html (js/versiones/mapa-v1.12.js) del repositorio Web Interna SP.</w:t>
       </w:r>
     </w:p>
     <w:p>
@@ -1984,7 +1984,7 @@
           <w:sz w:val="21"/>
           <w:szCs w:val="21"/>
         </w:rPr>
-        <w:t>Seguridad para consorcios, edificios y depósitos. Alarma monitoreada, videovigilancia y control de accesos para espacios comunes y accesos.</w:t>
+        <w:t>Seguridad para consorcios y edificios. Alarma monitoreada, videovigilancia y control de accesos para espacios comunes y accesos.</w:t>
       </w:r>
     </w:p>
     <w:tbl>
@@ -4041,7 +4041,7 @@
                 <w:sz w:val="20"/>
                 <w:szCs w:val="20"/>
               </w:rPr>
-              <w:t xml:space="preserve">App Ajax Security</w:t>
+              <w:t>APP para usuario final</w:t>
             </w:r>
           </w:p>
         </w:tc>
@@ -4062,7 +4062,7 @@
                 <w:sz w:val="20"/>
                 <w:szCs w:val="20"/>
               </w:rPr>
-              <w:t xml:space="preserve">Control total desde el celular. Disponible en smartphone y Apple Watch.</w:t>
+              <w:t>Control del sistema desde el celular: activación y desactivación del servicio y visualización de cámaras. Según el equipo instalado: Ajax Security, Hik-Connect o Garnet.</w:t>
             </w:r>
           </w:p>
         </w:tc>
@@ -4319,7 +4319,7 @@
           <w:sz w:val="21"/>
           <w:szCs w:val="21"/>
         </w:rPr>
-        <w:t>Historial de revisiones del Mapa de Servicios tal como se registra en el código del portal (js/versiones/mapa-v1.0.js a mapa-v1.11.js — no existe mapa-v1.6.js: esa revisión fue exclusiva de este documento, ver tabla).</w:t>
+        <w:t>Historial de revisiones del Mapa de Servicios tal como se registra en el código del portal (js/versiones/mapa-v1.0.js a mapa-v1.12.js — no existe mapa-v1.6.js: esa revisión fue exclusiva de este documento, ver tabla).</w:t>
       </w:r>
     </w:p>
     <w:tbl>
@@ -4921,11 +4921,61 @@
               <w:rPr>
                 <w:b/>
                 <w:bCs/>
+                <w:sz w:val="20"/>
+                <w:szCs w:val="20"/>
+              </w:rPr>
+              <w:t>V1.11</w:t>
+            </w:r>
+          </w:p>
+        </w:tc>
+        <w:tc>
+          <w:tcPr>
+            <w:tcW w:type="dxa" w:w="7800"/>
+            <w:shd w:fill="FFFFFF" w:val="clear"/>
+            <w:tcMar>
+              <w:top w:type="dxa" w:w="100"/>
+              <w:left w:type="dxa" w:w="120"/>
+              <w:bottom w:type="dxa" w:w="100"/>
+              <w:right w:type="dxa" w:w="120"/>
+            </w:tcMar>
+          </w:tcPr>
+          <w:p>
+            <w:r>
+              <w:rPr>
+                <w:sz w:val="20"/>
+                <w:szCs w:val="20"/>
+              </w:rPr>
+              <w:t>Revisión 10 — se agrega el texto de introducción del segmento "Vigilancia presencial" (propuesto por Claude a partir de los lineamientos de Martin, aprobada la Opción B).</w:t>
+            </w:r>
+          </w:p>
+        </w:tc>
+      </w:tr>
+      <w:tr>
+        <w:trPr>
+          <w:cantSplit/>
+          <w:cantSplit/>
+        </w:trPr>
+        <w:tc>
+          <w:tcPr>
+            <w:tcW w:type="dxa" w:w="1560"/>
+            <w:shd w:fill="FFFFFF" w:val="clear"/>
+            <w:tcMar>
+              <w:top w:type="dxa" w:w="100"/>
+              <w:left w:type="dxa" w:w="120"/>
+              <w:bottom w:type="dxa" w:w="100"/>
+              <w:right w:type="dxa" w:w="120"/>
+            </w:tcMar>
+          </w:tcPr>
+          <w:p>
+            <w:r>
+              <w:rPr>
+                <w:b/>
+                <w:bCs/>
                 <w:color w:val="C0392B"/>
                 <w:sz w:val="20"/>
                 <w:szCs w:val="20"/>
               </w:rPr>
-              <w:t>V1.11 (actual)</w:t>
+              <w:t>V1.12 (actual)</w:t>
             </w:r>
           </w:p>
         </w:tc>
@@ -4946,7 +4996,7 @@
                 <w:sz w:val="20"/>
                 <w:szCs w:val="20"/>
               </w:rPr>
-              <w:t>Revisión 10 — se agrega el texto de introducción del segmento "Vigilancia presencial" (propuesto por Claude a partir de los lineamientos de Martin, aprobada la Opción B).</w:t>
+              <w:t>Revisión 11 — se renombra el servicio transversal "App Ajax Security" a "APP para usuario final" con descripción genérica multi-marca (Ajax, Hik-Connect, Garnet), y se ajusta la introducción de Consorcios y Edificios (se quita la mención a "depósitos").</w:t>
             </w:r>
           </w:p>
         </w:tc>
@@ -4969,7 +5019,7 @@
           <w:sz w:val="21"/>
           <w:szCs w:val="21"/>
         </w:rPr>
-        <w:t>Nota: el contenido de los servicios (segmentos, tarjetas y transversales) refleja la versión v1.11 del portal, la más reciente cargada en el sitio a la fecha indicada — incluye la unificación de Alarma monitoreada y Videovigilancia en Hogar, en Comercio y en Consorcios y Edificios (mismo contenido que Hogar en este último caso), la eliminación de "Control de accesos" como servicio de Comercio, la separación de "Vigilancia presencial" como segmento propio de Consorcios y Edificios (al mismo nivel que Hogar/Comercio/Obras/Empresas), y la corrección del "Diferencial" de "Alarma monitoreada + Videovigilancia" en los tres segmentos donde existe: la revisión de imágenes en tiempo real ante una alerta queda atribuida al servicio Videoverificación, no al servicio base. El renglón "Cancelación: [A completar]" al pie de cada uno de los 6 servicios principales y la sección "Glosario" existen únicamente en este Word — no tienen todavía un equivalente en pages/mapa-servicios.html. La introducción del segmento "Vigilancia presencial" fue redactada por Claude a partir de los lineamientos de Martin y aprobada por él. Si el contenido de los servicios se actualiza en el sitio, este documento debe regenerarse para mantenerse alineado.</w:t>
+        <w:t>Nota: el contenido de los servicios (segmentos, tarjetas y transversales) refleja la versión v1.12 del portal, la más reciente cargada en el sitio a la fecha indicada — incluye la unificación de Alarma monitoreada y Videovigilancia en Hogar, en Comercio y en Consorcios y Edificios (mismo contenido que Hogar en este último caso), la eliminación de "Control de accesos" como servicio de Comercio, la separación de "Vigilancia presencial" como segmento propio de Consorcios y Edificios (al mismo nivel que Hogar/Comercio/Obras/Empresas), y la corrección del "Diferencial" de "Alarma monitoreada + Videovigilancia" en los tres segmentos donde existe: la revisión de imágenes en tiempo real ante una alerta queda atribuida al servicio Videoverificación, no al servicio base. El renglón "Cancelación: [A completar]" al pie de cada uno de los 6 servicios principales y la sección "Glosario" existen únicamente en este Word — no tienen todavía un equivalente en pages/mapa-servicios.html. La introducción del segmento "Vigilancia presencial" fue redactada por Claude a partir de los lineamientos de Martin y aprobada por él. El servicio transversal "App Ajax Security" pasó a llamarse "APP para usuario final" (descripción genérica, ya no menciona una marca específica en el nombre) y la introducción de Consorcios y Edificios ya no menciona "depósitos". Si el contenido de los servicios se actualiza en el sitio, este documento debe regenerarse para mantenerse alineado.</w:t>
       </w:r>
     </w:p>
     <w:p>
@@ -5138,7 +5188,7 @@
                 <w:sz w:val="20"/>
                 <w:szCs w:val="20"/>
               </w:rPr>
-              <w:t xml:space="preserve">App Ajax Security / Hik-Connect</w:t>
+              <w:t>APP para usuario final (Ajax Security / Hik-Connect / Garnet)</w:t>
             </w:r>
           </w:p>
         </w:tc>
@@ -5159,7 +5209,7 @@
                 <w:sz w:val="20"/>
                 <w:szCs w:val="20"/>
               </w:rPr>
-              <w:t xml:space="preserve">Aplicaciones para celular con las que el cliente controla el sistema de forma remota: armado/desarmado, notificaciones y, según el equipo instalado, acceso a cámaras.</w:t>
+              <w:t>Aplicación para celular con la que el cliente controla el sistema de forma remota: activación y desactivación del servicio, notificaciones y, según el equipo instalado, visualización de cámaras. El nombre de la app varía según el fabricante del equipo instalado (Ajax Security, Hik-Connect o Garnet).</w:t>
             </w:r>
           </w:p>
         </w:tc>

</xml_diff>

<commit_message>
modificacion menu mapa de servicios
</commit_message>
<xml_diff>
--- a/Mapa_de_Servicios_SP.docx
+++ b/Mapa_de_Servicios_SP.docx
@@ -37,11 +37,9 @@
       <w:r>
         <w:rPr>
           <w:b/>
-          <w:bCs/>
-          <w:sz w:val="21"/>
-          <w:szCs w:val="21"/>
-        </w:rPr>
-        <w:t>Versión V1.12 — Revisión 11: se renombra "App Ajax Security" a "APP para usuario final" (servicio transversal, descripción genérica multi-marca) y se ajusta la introducción de Consorcios y Edificios (se quita la mención a "depósitos").</w:t>
+          <w:sz w:val="21"/>
+        </w:rPr>
+        <w:t>Versión V1.13 — Revisión 12: se organiza el documento en 3 partes (Parte 1 — Servicios, Parte 2 — Servicios Transversales, Parte 3 — Glosario), reflejando el mismo menú de 3 mosaicos ya aplicado en la web. Sin cambios de contenido de servicios, segmentos, transversales ni glosario respecto a V1.12.</w:t>
       </w:r>
     </w:p>
     <w:p>
@@ -63,13 +61,10 @@
       </w:pPr>
       <w:r>
         <w:rPr>
-          <w:i/>
-          <w:iCs/>
           <w:color w:val="6B7280"/>
           <w:sz w:val="18"/>
-          <w:szCs w:val="18"/>
-        </w:rPr>
-        <w:t>Fuente: contenido vigente en pages/mapa-servicios.html (js/versiones/mapa-v1.12.js) del repositorio Web Interna SP.</w:t>
+        </w:rPr>
+        <w:t>Fuente: contenido vigente en pages/mapa-servicios-catalogo.html, mapa-servicios-transversales.html y mapa-servicios-glosario.html (js/versiones/mapa-v1.13.js) del repositorio Web Interna SP.</w:t>
       </w:r>
     </w:p>
     <w:p>
@@ -109,6 +104,19 @@
           <w:szCs w:val="21"/>
         </w:rPr>
         <w:t xml:space="preserve">Cada servicio se describe con su propuesta de valor, el problema que resuelve, lo que incluye, el esquema de facturación y su diferencial frente a alternativas del mercado. Dos servicios cuentan además con ficha de producto propia dentro del portal: Comercio Seguro y SP Obra Segura.</w:t>
+      </w:r>
+    </w:p>
+    <w:p>
+      <w:pPr>
+        <w:pStyle w:val="Title"/>
+        <w:spacing w:before="600" w:after="80"/>
+      </w:pPr>
+      <w:r>
+        <w:rPr>
+          <w:b/>
+          <w:color w:val="1B2A4A"/>
+        </w:rPr>
+        <w:t>PARTE 1 — SERVICIOS</w:t>
       </w:r>
     </w:p>
     <w:p>
@@ -3838,6 +3846,19 @@
     </w:p>
     <w:p>
       <w:pPr>
+        <w:pStyle w:val="Title"/>
+        <w:spacing w:before="600" w:after="80"/>
+      </w:pPr>
+      <w:r>
+        <w:rPr>
+          <w:b/>
+          <w:color w:val="1B2A4A"/>
+        </w:rPr>
+        <w:t>PARTE 2 — SERVICIOS TRANSVERSALES</w:t>
+      </w:r>
+    </w:p>
+    <w:p>
+      <w:pPr>
         <w:pStyle w:val="Heading1"/>
         <w:spacing w:after="200" w:before="400"/>
       </w:pPr>
@@ -4313,13 +4334,10 @@
       </w:pPr>
       <w:r>
         <w:rPr>
-          <w:i w:val="false"/>
-          <w:iCs w:val="false"/>
           <w:color w:val="222222"/>
           <w:sz w:val="21"/>
-          <w:szCs w:val="21"/>
-        </w:rPr>
-        <w:t>Historial de revisiones del Mapa de Servicios tal como se registra en el código del portal (js/versiones/mapa-v1.0.js a mapa-v1.12.js — no existe mapa-v1.6.js: esa revisión fue exclusiva de este documento, ver tabla).</w:t>
+        </w:rPr>
+        <w:t>Historial de revisiones del Mapa de Servicios tal como se registra en el código del portal (js/versiones/mapa-v1.0.js a mapa-v1.13.js — no existe mapa-v1.6.js: esa revisión fue exclusiva de este documento, ver tabla).</w:t>
       </w:r>
     </w:p>
     <w:tbl>
@@ -4971,11 +4989,61 @@
               <w:rPr>
                 <w:b/>
                 <w:bCs/>
+                <w:sz w:val="20"/>
+                <w:szCs w:val="20"/>
+              </w:rPr>
+              <w:t>V1.12</w:t>
+            </w:r>
+          </w:p>
+        </w:tc>
+        <w:tc>
+          <w:tcPr>
+            <w:tcW w:type="dxa" w:w="7800"/>
+            <w:shd w:fill="FFFFFF" w:val="clear"/>
+            <w:tcMar>
+              <w:top w:type="dxa" w:w="100"/>
+              <w:left w:type="dxa" w:w="120"/>
+              <w:bottom w:type="dxa" w:w="100"/>
+              <w:right w:type="dxa" w:w="120"/>
+            </w:tcMar>
+          </w:tcPr>
+          <w:p>
+            <w:r>
+              <w:rPr>
+                <w:sz w:val="20"/>
+                <w:szCs w:val="20"/>
+              </w:rPr>
+              <w:t>Revisión 11 — se renombra el servicio transversal "App Ajax Security" a "APP para usuario final" con descripción genérica multi-marca (Ajax, Hik-Connect, Garnet), y se ajusta la introducción de Consorcios y Edificios (se quita la mención a "depósitos").</w:t>
+            </w:r>
+          </w:p>
+        </w:tc>
+      </w:tr>
+      <w:tr>
+        <w:trPr>
+          <w:cantSplit/>
+          <w:cantSplit/>
+        </w:trPr>
+        <w:tc>
+          <w:tcPr>
+            <w:tcW w:type="dxa" w:w="1560"/>
+            <w:shd w:fill="FFFFFF" w:val="clear"/>
+            <w:tcMar>
+              <w:top w:type="dxa" w:w="100"/>
+              <w:left w:type="dxa" w:w="120"/>
+              <w:bottom w:type="dxa" w:w="100"/>
+              <w:right w:type="dxa" w:w="120"/>
+            </w:tcMar>
+          </w:tcPr>
+          <w:p>
+            <w:r>
+              <w:rPr>
+                <w:b/>
+                <w:bCs/>
                 <w:color w:val="C0392B"/>
                 <w:sz w:val="20"/>
                 <w:szCs w:val="20"/>
               </w:rPr>
-              <w:t>V1.12 (actual)</w:t>
+              <w:t>V1.13 (actual)</w:t>
             </w:r>
           </w:p>
         </w:tc>
@@ -4996,7 +5064,7 @@
                 <w:sz w:val="20"/>
                 <w:szCs w:val="20"/>
               </w:rPr>
-              <w:t>Revisión 11 — se renombra el servicio transversal "App Ajax Security" a "APP para usuario final" con descripción genérica multi-marca (Ajax, Hik-Connect, Garnet), y se ajusta la introducción de Consorcios y Edificios (se quita la mención a "depósitos").</w:t>
+              <w:t>Revisión 12 — se organiza el documento en 3 partes (Parte 1 — Servicios, Parte 2 — Servicios Transversales, Parte 3 — Glosario), reflejando el menú de 3 mosaicos ya aplicado en la web. Sin cambios de contenido de servicios/segmentos/transversales/glosario. Cambio en docx (este documento) y web (páginas separadas: mapa-servicios-catalogo.html, mapa-servicios-transversales.html, mapa-servicios-glosario.html; js/versiones/mapa-v1.13.js con el campo `glosario` agregado, 24 términos).</w:t>
             </w:r>
           </w:p>
         </w:tc>
@@ -5013,13 +5081,23 @@
       </w:pPr>
       <w:r>
         <w:rPr>
-          <w:i/>
-          <w:iCs/>
           <w:color w:val="6B7280"/>
           <w:sz w:val="21"/>
-          <w:szCs w:val="21"/>
-        </w:rPr>
-        <w:t>Nota: el contenido de los servicios (segmentos, tarjetas y transversales) refleja la versión v1.12 del portal, la más reciente cargada en el sitio a la fecha indicada — incluye la unificación de Alarma monitoreada y Videovigilancia en Hogar, en Comercio y en Consorcios y Edificios (mismo contenido que Hogar en este último caso), la eliminación de "Control de accesos" como servicio de Comercio, la separación de "Vigilancia presencial" como segmento propio de Consorcios y Edificios (al mismo nivel que Hogar/Comercio/Obras/Empresas), y la corrección del "Diferencial" de "Alarma monitoreada + Videovigilancia" en los tres segmentos donde existe: la revisión de imágenes en tiempo real ante una alerta queda atribuida al servicio Videoverificación, no al servicio base. El renglón "Cancelación: [A completar]" al pie de cada uno de los 6 servicios principales y la sección "Glosario" existen únicamente en este Word — no tienen todavía un equivalente en pages/mapa-servicios.html. La introducción del segmento "Vigilancia presencial" fue redactada por Claude a partir de los lineamientos de Martin y aprobada por él. El servicio transversal "App Ajax Security" pasó a llamarse "APP para usuario final" (descripción genérica, ya no menciona una marca específica en el nombre) y la introducción de Consorcios y Edificios ya no menciona "depósitos". Si el contenido de los servicios se actualiza en el sitio, este documento debe regenerarse para mantenerse alineado.</w:t>
+        </w:rPr>
+        <w:t>Nota: el contenido de los servicios (segmentos, tarjetas y transversales) refleja la versión v1.12 del portal, la más reciente cargada en el sitio a la fecha indicada — incluye la unificación de Alarma monitoreada y Videovigilancia en Hogar, en Comercio y en Consorcios y Edificios (mismo contenido que Hogar en este último caso), la eliminación de "Control de accesos" como servicio de Comercio, la separación de "Vigilancia presencial" como segmento propio de Consorcios y Edificios (al mismo nivel que Hogar/Comercio/Obras/Empresas), y la corrección del "Diferencial" de "Alarma monitoreada + Videovigilancia" en los tres segmentos donde existe: la revisión de imágenes en tiempo real ante una alerta queda atribuida al servicio Videoverificación, no al servicio base. El renglón "Cancelación: [A completar]" al pie de cada uno de los 6 servicios principales existe únicamente en este Word — no tiene todavía un equivalente en la web. La sección "Glosario" (24 términos) sí tiene ahora equivalente en la web, dado de alta en V1.13 (pages/mapa-servicios-glosario.html), con el mismo contenido que este Word, sin reescritura. La introducción del segmento "Vigilancia presencial" fue redactada por Claude a partir de los lineamientos de Martin y aprobada por él. El servicio transversal "App Ajax Security" pasó a llamarse "APP para usuario final" (descripción genérica, ya no menciona una marca específica en el nombre) y la introducción de Consorcios y Edificios ya no menciona "depósitos". Si el contenido de los servicios se actualiza en el sitio, este documento debe regenerarse para mantenerse alineado. Además, en esta revisión (V1.13) este documento se organizó en 3 partes (Parte 1 — Servicios, Parte 2 — Servicios Transversales, Parte 3 — Glosario), reflejando el menú de 3 mosaicos que ya tiene la web (pages/mapa-servicios.html) — no se movió contenido de lugar, solo se agregaron los 3 encabezados de parte.</w:t>
+      </w:r>
+    </w:p>
+    <w:p>
+      <w:pPr>
+        <w:pStyle w:val="Title"/>
+        <w:spacing w:before="600" w:after="80"/>
+      </w:pPr>
+      <w:r>
+        <w:rPr>
+          <w:b/>
+          <w:color w:val="1B2A4A"/>
+        </w:rPr>
+        <w:t>PARTE 3 — GLOSARIO</w:t>
       </w:r>
     </w:p>
     <w:p>

</xml_diff>